<commit_message>
Visual Effect UI 전달내용 적용
</commit_message>
<xml_diff>
--- a/V1/Documents/3DMI Develop Spec.docx
+++ b/V1/Documents/3DMI Develop Spec.docx
@@ -241,28 +241,13 @@
           <w:rFonts w:hint="eastAsia"/>
           <w:lang w:val="ko-KR"/>
         </w:rPr>
-        <w:t>제목</w:t>
-      </w:r>
-      <w:proofErr w:type="gramStart"/>
-      <w:r>
-        <w:rPr>
-          <w:rFonts w:hint="eastAsia"/>
-          <w:lang w:val="ko-KR"/>
-        </w:rPr>
-        <w:t>3</w:t>
-      </w:r>
-      <w:r>
-        <w:rPr>
-          <w:lang w:val="ko-KR"/>
-        </w:rPr>
-        <w:t xml:space="preserve"> :</w:t>
-      </w:r>
-      <w:proofErr w:type="gramEnd"/>
-      <w:r>
-        <w:rPr>
-          <w:lang w:val="ko-KR"/>
-        </w:rPr>
-        <w:t xml:space="preserve"> 0.2</w:t>
+        <w:t>제목3</w:t>
+      </w:r>
+      <w:r>
+        <w:rPr>
+          <w:lang w:val="ko-KR"/>
+        </w:rPr>
+        <w:t xml:space="preserve"> : 0.2</w:t>
       </w:r>
       <w:r>
         <w:rPr>
@@ -341,35 +326,24 @@
         <w:pStyle w:val="1"/>
       </w:pPr>
       <w:bookmarkStart w:id="0" w:name="_Toc152235118"/>
-      <w:proofErr w:type="spellStart"/>
       <w:r>
         <w:lastRenderedPageBreak/>
-        <w:t>Visual</w:t>
-      </w:r>
-      <w:proofErr w:type="spellEnd"/>
-      <w:r>
-        <w:t xml:space="preserve"> </w:t>
-      </w:r>
-      <w:proofErr w:type="spellStart"/>
-      <w:r>
-        <w:t>Effect</w:t>
+        <w:t>Visual Effect</w:t>
       </w:r>
       <w:bookmarkEnd w:id="0"/>
-      <w:proofErr w:type="spellEnd"/>
     </w:p>
     <w:p>
       <w:pPr>
         <w:pStyle w:val="2"/>
         <w:numPr>
           <w:ilvl w:val="0"/>
-          <w:numId w:val="40"/>
+          <w:numId w:val="42"/>
         </w:numPr>
         <w:rPr>
           <w:lang w:val="ko-KR"/>
         </w:rPr>
       </w:pPr>
       <w:bookmarkStart w:id="1" w:name="_Toc152235119"/>
-      <w:proofErr w:type="spellStart"/>
       <w:r>
         <w:rPr>
           <w:rFonts w:hint="eastAsia"/>
@@ -381,234 +355,768 @@
         <w:rPr>
           <w:lang w:val="ko-KR"/>
         </w:rPr>
-        <w:t>isual</w:t>
-      </w:r>
-      <w:proofErr w:type="spellEnd"/>
+        <w:t>isual Effect Option</w:t>
+      </w:r>
+      <w:bookmarkEnd w:id="1"/>
+    </w:p>
+    <w:p>
+      <w:pPr>
+        <w:pStyle w:val="3"/>
+        <w:rPr>
+          <w:lang w:val="ko-KR"/>
+        </w:rPr>
+      </w:pPr>
+      <w:r>
+        <w:rPr>
+          <w:lang w:val="ko-KR"/>
+        </w:rPr>
+        <w:t>Shadow</w:t>
+      </w:r>
+    </w:p>
+    <w:p>
+      <w:pPr>
+        <w:pStyle w:val="4"/>
+        <w:rPr>
+          <w:lang w:val="ko-KR"/>
+        </w:rPr>
+      </w:pPr>
+      <w:r>
+        <w:rPr>
+          <w:lang w:val="ko-KR"/>
+        </w:rPr>
+        <w:t>mode</w:t>
+      </w:r>
+    </w:p>
+    <w:p>
+      <w:pPr>
+        <w:pStyle w:val="5"/>
+      </w:pPr>
+      <w:r>
+        <w:t xml:space="preserve">Type: </w:t>
+      </w:r>
+      <w:r>
+        <w:t>enum ShadowMode (</w:t>
+      </w:r>
+      <w:r>
+        <w:t>S</w:t>
+      </w:r>
+      <w:r>
+        <w:t>oft, Hard)</w:t>
+      </w:r>
+    </w:p>
+    <w:p>
+      <w:pPr>
+        <w:pStyle w:val="5"/>
+        <w:rPr>
+          <w:lang w:val="ko-KR"/>
+        </w:rPr>
+      </w:pPr>
+      <w:r>
+        <w:rPr>
+          <w:rFonts w:hint="eastAsia"/>
+        </w:rPr>
+        <w:t xml:space="preserve">default </w:t>
+      </w:r>
+      <w:r>
+        <w:t>value</w:t>
+      </w:r>
+      <w:r>
+        <w:rPr>
+          <w:lang w:val="ko-KR"/>
+        </w:rPr>
+        <w:t>:</w:t>
+      </w:r>
       <w:r>
         <w:rPr>
           <w:lang w:val="ko-KR"/>
         </w:rPr>
         <w:t xml:space="preserve"> </w:t>
       </w:r>
-      <w:proofErr w:type="spellStart"/>
-      <w:r>
-        <w:rPr>
-          <w:lang w:val="ko-KR"/>
-        </w:rPr>
-        <w:t>Effect</w:t>
-      </w:r>
-      <w:proofErr w:type="spellEnd"/>
+      <w:r>
+        <w:t>S</w:t>
+      </w:r>
+      <w:r>
+        <w:t>oft</w:t>
+      </w:r>
+    </w:p>
+    <w:p>
+      <w:pPr>
+        <w:pStyle w:val="4"/>
+        <w:rPr>
+          <w:lang w:val="ko-KR"/>
+        </w:rPr>
+      </w:pPr>
+      <w:r>
+        <w:rPr>
+          <w:lang w:val="ko-KR"/>
+        </w:rPr>
+        <w:t>r</w:t>
+      </w:r>
+      <w:r>
+        <w:rPr>
+          <w:lang w:val="ko-KR"/>
+        </w:rPr>
+        <w:t>esolution</w:t>
+      </w:r>
+    </w:p>
+    <w:p>
+      <w:pPr>
+        <w:pStyle w:val="5"/>
+        <w:rPr>
+          <w:lang w:val="ko-KR"/>
+        </w:rPr>
+      </w:pPr>
+      <w:r>
+        <w:rPr>
+          <w:rFonts w:hint="eastAsia"/>
+          <w:lang w:val="ko-KR"/>
+        </w:rPr>
+        <w:t>T</w:t>
+      </w:r>
+      <w:r>
+        <w:rPr>
+          <w:lang w:val="ko-KR"/>
+        </w:rPr>
+        <w:t>ype: int (</w:t>
+      </w:r>
+      <w:r>
+        <w:rPr>
+          <w:lang w:val="ko-KR"/>
+        </w:rPr>
+        <w:t>32~1024)</w:t>
+      </w:r>
+    </w:p>
+    <w:p>
+      <w:pPr>
+        <w:pStyle w:val="5"/>
+        <w:rPr>
+          <w:lang w:val="ko-KR"/>
+        </w:rPr>
+      </w:pPr>
+      <w:r>
+        <w:rPr>
+          <w:rFonts w:hint="eastAsia"/>
+        </w:rPr>
+        <w:t xml:space="preserve">default </w:t>
+      </w:r>
+      <w:r>
+        <w:t>value</w:t>
+      </w:r>
+      <w:r>
+        <w:rPr>
+          <w:lang w:val="ko-KR"/>
+        </w:rPr>
+        <w:t xml:space="preserve">: </w:t>
+      </w:r>
+      <w:r>
+        <w:rPr>
+          <w:lang w:val="ko-KR"/>
+        </w:rPr>
+        <w:t>256</w:t>
+      </w:r>
+    </w:p>
+    <w:p>
+      <w:pPr>
+        <w:pStyle w:val="5"/>
+      </w:pPr>
+      <w:r>
+        <w:t xml:space="preserve">UI </w:t>
+      </w:r>
+      <w:r>
+        <w:rPr>
+          <w:rFonts w:hint="eastAsia"/>
+        </w:rPr>
+        <w:t>설정</w:t>
+      </w:r>
+    </w:p>
+    <w:p>
+      <w:pPr>
+        <w:pStyle w:val="6"/>
+      </w:pPr>
+      <w:r>
+        <w:rPr>
+          <w:rFonts w:hint="eastAsia"/>
+        </w:rPr>
+        <w:t>T</w:t>
+      </w:r>
+      <w:r>
+        <w:t>ype: slide</w:t>
+      </w:r>
+    </w:p>
+    <w:p>
+      <w:pPr>
+        <w:pStyle w:val="6"/>
+      </w:pPr>
+      <w:r>
+        <w:rPr>
+          <w:rFonts w:hint="eastAsia"/>
+        </w:rPr>
+        <w:t>d</w:t>
+      </w:r>
+      <w:r>
+        <w:t xml:space="preserve">efault value: </w:t>
+      </w:r>
+      <w:r>
+        <w:t>3</w:t>
+      </w:r>
+    </w:p>
+    <w:p>
+      <w:pPr>
+        <w:pStyle w:val="6"/>
+        <w:rPr>
+          <w:lang w:val="ko-KR"/>
+        </w:rPr>
+      </w:pPr>
+      <w:r>
+        <w:rPr>
+          <w:rFonts w:hint="eastAsia"/>
+        </w:rPr>
+        <w:t>R</w:t>
+      </w:r>
+      <w:r>
+        <w:t>ange: 1 ~ 10</w:t>
+      </w:r>
+    </w:p>
+    <w:p>
+      <w:pPr>
+        <w:pStyle w:val="4"/>
+        <w:rPr>
+          <w:lang w:val="ko-KR"/>
+        </w:rPr>
+      </w:pPr>
+      <w:r>
+        <w:rPr>
+          <w:lang w:val="ko-KR"/>
+        </w:rPr>
+        <w:t>b</w:t>
+      </w:r>
+      <w:r>
+        <w:rPr>
+          <w:lang w:val="ko-KR"/>
+        </w:rPr>
+        <w:t>lurring</w:t>
+      </w:r>
+    </w:p>
+    <w:p>
+      <w:pPr>
+        <w:pStyle w:val="5"/>
+        <w:rPr>
+          <w:lang w:val="ko-KR"/>
+        </w:rPr>
+      </w:pPr>
+      <w:r>
+        <w:rPr>
+          <w:rFonts w:hint="eastAsia"/>
+          <w:lang w:val="ko-KR"/>
+        </w:rPr>
+        <w:t>T</w:t>
+      </w:r>
+      <w:r>
+        <w:rPr>
+          <w:lang w:val="ko-KR"/>
+        </w:rPr>
+        <w:t>ype: int (1~31)</w:t>
+      </w:r>
+    </w:p>
+    <w:p>
+      <w:pPr>
+        <w:pStyle w:val="5"/>
+        <w:rPr>
+          <w:lang w:val="ko-KR"/>
+        </w:rPr>
+      </w:pPr>
+      <w:r>
+        <w:rPr>
+          <w:rFonts w:hint="eastAsia"/>
+        </w:rPr>
+        <w:t xml:space="preserve">default </w:t>
+      </w:r>
+      <w:r>
+        <w:t>value</w:t>
+      </w:r>
+      <w:r>
+        <w:rPr>
+          <w:lang w:val="ko-KR"/>
+        </w:rPr>
+        <w:t xml:space="preserve">: </w:t>
+      </w:r>
+      <w:r>
+        <w:rPr>
+          <w:lang w:val="ko-KR"/>
+        </w:rPr>
+        <w:t>1</w:t>
+      </w:r>
+    </w:p>
+    <w:p>
+      <w:pPr>
+        <w:pStyle w:val="5"/>
+      </w:pPr>
+      <w:r>
+        <w:t xml:space="preserve">UI </w:t>
+      </w:r>
+      <w:r>
+        <w:rPr>
+          <w:rFonts w:hint="eastAsia"/>
+        </w:rPr>
+        <w:t>설정</w:t>
+      </w:r>
+    </w:p>
+    <w:p>
+      <w:pPr>
+        <w:pStyle w:val="6"/>
+      </w:pPr>
+      <w:r>
+        <w:rPr>
+          <w:rFonts w:hint="eastAsia"/>
+        </w:rPr>
+        <w:t>T</w:t>
+      </w:r>
+      <w:r>
+        <w:t>ype: slide</w:t>
+      </w:r>
+    </w:p>
+    <w:p>
+      <w:pPr>
+        <w:pStyle w:val="6"/>
+      </w:pPr>
+      <w:r>
+        <w:rPr>
+          <w:rFonts w:hint="eastAsia"/>
+        </w:rPr>
+        <w:t>d</w:t>
+      </w:r>
+      <w:r>
+        <w:t>efault value: 1</w:t>
+      </w:r>
+    </w:p>
+    <w:p>
+      <w:pPr>
+        <w:pStyle w:val="6"/>
+        <w:rPr>
+          <w:lang w:val="ko-KR"/>
+        </w:rPr>
+      </w:pPr>
+      <w:r>
+        <w:rPr>
+          <w:rFonts w:hint="eastAsia"/>
+        </w:rPr>
+        <w:t>R</w:t>
+      </w:r>
+      <w:r>
+        <w:t xml:space="preserve">ange: 1 ~ </w:t>
+      </w:r>
+      <w:r>
+        <w:t>10</w:t>
+      </w:r>
+    </w:p>
+    <w:p>
+      <w:pPr>
+        <w:pStyle w:val="4"/>
+        <w:rPr>
+          <w:lang w:val="ko-KR"/>
+        </w:rPr>
+      </w:pPr>
+      <w:r>
+        <w:rPr>
+          <w:lang w:val="ko-KR"/>
+        </w:rPr>
+        <w:t>Ignore</w:t>
+      </w:r>
       <w:r>
         <w:rPr>
           <w:lang w:val="ko-KR"/>
         </w:rPr>
         <w:t xml:space="preserve"> </w:t>
       </w:r>
-      <w:proofErr w:type="spellStart"/>
-      <w:r>
-        <w:rPr>
-          <w:lang w:val="ko-KR"/>
-        </w:rPr>
-        <w:t>Option</w:t>
-      </w:r>
-      <w:bookmarkEnd w:id="1"/>
-      <w:proofErr w:type="spellEnd"/>
+      <w:r>
+        <w:rPr>
+          <w:lang w:val="ko-KR"/>
+        </w:rPr>
+        <w:t>Transparency</w:t>
+      </w:r>
+    </w:p>
+    <w:p>
+      <w:pPr>
+        <w:pStyle w:val="5"/>
+        <w:rPr>
+          <w:lang w:val="ko-KR"/>
+        </w:rPr>
+      </w:pPr>
+      <w:r>
+        <w:rPr>
+          <w:rFonts w:hint="eastAsia"/>
+          <w:lang w:val="ko-KR"/>
+        </w:rPr>
+        <w:t>T</w:t>
+      </w:r>
+      <w:r>
+        <w:rPr>
+          <w:lang w:val="ko-KR"/>
+        </w:rPr>
+        <w:t>ype: bool</w:t>
+      </w:r>
+    </w:p>
+    <w:p>
+      <w:pPr>
+        <w:pStyle w:val="5"/>
+        <w:rPr>
+          <w:lang w:val="ko-KR"/>
+        </w:rPr>
+      </w:pPr>
+      <w:r>
+        <w:rPr>
+          <w:rFonts w:hint="eastAsia"/>
+        </w:rPr>
+        <w:t xml:space="preserve">default </w:t>
+      </w:r>
+      <w:r>
+        <w:t>value</w:t>
+      </w:r>
+      <w:r>
+        <w:rPr>
+          <w:lang w:val="ko-KR"/>
+        </w:rPr>
+        <w:t xml:space="preserve">: </w:t>
+      </w:r>
+      <w:r>
+        <w:rPr>
+          <w:lang w:val="ko-KR"/>
+        </w:rPr>
+        <w:t>false</w:t>
+      </w:r>
+    </w:p>
+    <w:p>
+      <w:pPr>
+        <w:pStyle w:val="4"/>
+        <w:rPr>
+          <w:lang w:val="ko-KR"/>
+        </w:rPr>
+      </w:pPr>
+      <w:r>
+        <w:rPr>
+          <w:lang w:val="ko-KR"/>
+        </w:rPr>
+        <w:t>color</w:t>
+      </w:r>
+    </w:p>
+    <w:p>
+      <w:pPr>
+        <w:pStyle w:val="5"/>
+        <w:rPr>
+          <w:lang w:val="ko-KR"/>
+        </w:rPr>
+      </w:pPr>
+      <w:r>
+        <w:rPr>
+          <w:rFonts w:hint="eastAsia"/>
+          <w:lang w:val="ko-KR"/>
+        </w:rPr>
+        <w:t>T</w:t>
+      </w:r>
+      <w:r>
+        <w:rPr>
+          <w:lang w:val="ko-KR"/>
+        </w:rPr>
+        <w:t xml:space="preserve">ype: </w:t>
+      </w:r>
+      <w:r>
+        <w:rPr>
+          <w:lang w:val="ko-KR"/>
+        </w:rPr>
+        <w:t>RGB</w:t>
+      </w:r>
+      <w:r>
+        <w:rPr>
+          <w:lang w:val="ko-KR"/>
+        </w:rPr>
+        <w:t>A</w:t>
+      </w:r>
+      <w:r>
+        <w:rPr>
+          <w:lang w:val="ko-KR"/>
+        </w:rPr>
+        <w:t>Color</w:t>
+      </w:r>
+    </w:p>
+    <w:p>
+      <w:pPr>
+        <w:pStyle w:val="5"/>
+      </w:pPr>
+      <w:r>
+        <w:rPr>
+          <w:rFonts w:hint="eastAsia"/>
+        </w:rPr>
+        <w:t xml:space="preserve">default </w:t>
+      </w:r>
+      <w:r>
+        <w:t>value: RGBAColor(0.</w:t>
+      </w:r>
+      <w:r>
+        <w:t>25f, 0.25f</w:t>
+      </w:r>
+      <w:r>
+        <w:t xml:space="preserve">, </w:t>
+      </w:r>
+      <w:r>
+        <w:t>0.25f</w:t>
+      </w:r>
+      <w:r>
+        <w:t>)</w:t>
+      </w:r>
+    </w:p>
+    <w:p>
+      <w:pPr>
+        <w:pStyle w:val="4"/>
+      </w:pPr>
+      <w:r>
+        <w:t>o</w:t>
+      </w:r>
+      <w:r>
+        <w:t>pacity</w:t>
+      </w:r>
+    </w:p>
+    <w:p>
+      <w:pPr>
+        <w:pStyle w:val="5"/>
+      </w:pPr>
+      <w:r>
+        <w:rPr>
+          <w:rFonts w:hint="eastAsia"/>
+        </w:rPr>
+        <w:t>T</w:t>
+      </w:r>
+      <w:r>
+        <w:t>ype: float</w:t>
+      </w:r>
+      <w:r>
+        <w:t xml:space="preserve"> (0~1)</w:t>
+      </w:r>
+    </w:p>
+    <w:p>
+      <w:pPr>
+        <w:pStyle w:val="5"/>
+      </w:pPr>
+      <w:r>
+        <w:t xml:space="preserve">default value: </w:t>
+      </w:r>
+      <w:r>
+        <w:t>1.0f</w:t>
+      </w:r>
+    </w:p>
+    <w:p>
+      <w:pPr>
+        <w:pStyle w:val="5"/>
+      </w:pPr>
+      <w:r>
+        <w:t xml:space="preserve">UI </w:t>
+      </w:r>
+      <w:r>
+        <w:rPr>
+          <w:rFonts w:hint="eastAsia"/>
+        </w:rPr>
+        <w:t>설정</w:t>
+      </w:r>
+    </w:p>
+    <w:p>
+      <w:pPr>
+        <w:pStyle w:val="6"/>
+      </w:pPr>
+      <w:r>
+        <w:rPr>
+          <w:rFonts w:hint="eastAsia"/>
+        </w:rPr>
+        <w:t>T</w:t>
+      </w:r>
+      <w:r>
+        <w:t>ype: slide</w:t>
+      </w:r>
+    </w:p>
+    <w:p>
+      <w:pPr>
+        <w:pStyle w:val="6"/>
+      </w:pPr>
+      <w:r>
+        <w:rPr>
+          <w:rFonts w:hint="eastAsia"/>
+        </w:rPr>
+        <w:t>d</w:t>
+      </w:r>
+      <w:r>
+        <w:t>efault value: 10</w:t>
+      </w:r>
+    </w:p>
+    <w:p>
+      <w:pPr>
+        <w:pStyle w:val="6"/>
+      </w:pPr>
+      <w:r>
+        <w:rPr>
+          <w:rFonts w:hint="eastAsia"/>
+        </w:rPr>
+        <w:t>R</w:t>
+      </w:r>
+      <w:r>
+        <w:t xml:space="preserve">ange: 1 ~ </w:t>
+      </w:r>
+      <w:r>
+        <w:t>1</w:t>
+      </w:r>
+      <w:r>
+        <w:t>0</w:t>
+      </w:r>
     </w:p>
     <w:p>
       <w:pPr>
         <w:pStyle w:val="3"/>
-        <w:rPr>
-          <w:lang w:val="ko-KR"/>
-        </w:rPr>
-      </w:pPr>
-      <w:proofErr w:type="spellStart"/>
-      <w:r>
-        <w:rPr>
-          <w:lang w:val="ko-KR"/>
-        </w:rPr>
-        <w:t>Shadow</w:t>
-      </w:r>
-      <w:proofErr w:type="spellEnd"/>
+      </w:pPr>
+      <w:r>
+        <w:t>Reflection</w:t>
+      </w:r>
+      <w:r>
+        <w:t xml:space="preserve"> </w:t>
+      </w:r>
+      <w:r>
+        <w:t>Plane</w:t>
+      </w:r>
     </w:p>
     <w:p>
       <w:pPr>
         <w:pStyle w:val="4"/>
-        <w:rPr>
-          <w:lang w:val="ko-KR"/>
-        </w:rPr>
-      </w:pPr>
-      <w:proofErr w:type="spellStart"/>
-      <w:r>
-        <w:rPr>
-          <w:lang w:val="ko-KR"/>
-        </w:rPr>
-        <w:t>mode</w:t>
-      </w:r>
-      <w:proofErr w:type="spellEnd"/>
+      </w:pPr>
+      <w:r>
+        <w:t>o</w:t>
+      </w:r>
+      <w:r>
+        <w:t>pacity</w:t>
+      </w:r>
     </w:p>
     <w:p>
       <w:pPr>
         <w:pStyle w:val="5"/>
       </w:pPr>
       <w:r>
-        <w:t xml:space="preserve">Type: </w:t>
-      </w:r>
-      <w:proofErr w:type="spellStart"/>
-      <w:r>
-        <w:t>enum</w:t>
-      </w:r>
-      <w:proofErr w:type="spellEnd"/>
-      <w:r>
-        <w:t xml:space="preserve"> </w:t>
-      </w:r>
-      <w:proofErr w:type="spellStart"/>
-      <w:r>
-        <w:t>ShadowMode</w:t>
-      </w:r>
-      <w:proofErr w:type="spellEnd"/>
-      <w:r>
-        <w:t xml:space="preserve"> (</w:t>
-      </w:r>
-      <w:r>
-        <w:t>None, S</w:t>
-      </w:r>
-      <w:r>
-        <w:t>oft, Hard)</w:t>
+        <w:rPr>
+          <w:rFonts w:hint="eastAsia"/>
+        </w:rPr>
+        <w:t>T</w:t>
+      </w:r>
+      <w:r>
+        <w:t>ype: float (0~1)</w:t>
       </w:r>
     </w:p>
     <w:p>
       <w:pPr>
         <w:pStyle w:val="5"/>
-        <w:rPr>
-          <w:lang w:val="ko-KR"/>
-        </w:rPr>
-      </w:pPr>
-      <w:r>
-        <w:rPr>
-          <w:rFonts w:hint="eastAsia"/>
-        </w:rPr>
-        <w:t xml:space="preserve">default </w:t>
-      </w:r>
-      <w:r>
-        <w:t>value</w:t>
-      </w:r>
-      <w:r>
-        <w:rPr>
-          <w:lang w:val="ko-KR"/>
-        </w:rPr>
-        <w:t>:</w:t>
-      </w:r>
-      <w:r>
-        <w:rPr>
-          <w:lang w:val="ko-KR"/>
-        </w:rPr>
-        <w:t xml:space="preserve"> </w:t>
-      </w:r>
-      <w:r>
-        <w:t>S</w:t>
-      </w:r>
-      <w:r>
-        <w:t>oft</w:t>
+      </w:pPr>
+      <w:r>
+        <w:t>default value: 0.5f</w:t>
+      </w:r>
+    </w:p>
+    <w:p>
+      <w:pPr>
+        <w:pStyle w:val="5"/>
+      </w:pPr>
+      <w:r>
+        <w:t xml:space="preserve">UI </w:t>
+      </w:r>
+      <w:r>
+        <w:rPr>
+          <w:rFonts w:hint="eastAsia"/>
+        </w:rPr>
+        <w:t>설정</w:t>
+      </w:r>
+    </w:p>
+    <w:p>
+      <w:pPr>
+        <w:pStyle w:val="6"/>
+      </w:pPr>
+      <w:r>
+        <w:rPr>
+          <w:rFonts w:hint="eastAsia"/>
+        </w:rPr>
+        <w:t>T</w:t>
+      </w:r>
+      <w:r>
+        <w:t>ype: slide</w:t>
+      </w:r>
+    </w:p>
+    <w:p>
+      <w:pPr>
+        <w:pStyle w:val="6"/>
+      </w:pPr>
+      <w:r>
+        <w:rPr>
+          <w:rFonts w:hint="eastAsia"/>
+        </w:rPr>
+        <w:t>d</w:t>
+      </w:r>
+      <w:r>
+        <w:t>efault value: 5</w:t>
+      </w:r>
+    </w:p>
+    <w:p>
+      <w:pPr>
+        <w:pStyle w:val="6"/>
+      </w:pPr>
+      <w:r>
+        <w:rPr>
+          <w:rFonts w:hint="eastAsia"/>
+        </w:rPr>
+        <w:t>R</w:t>
+      </w:r>
+      <w:r>
+        <w:t>ange: 1 ~ 10</w:t>
       </w:r>
     </w:p>
     <w:p>
       <w:pPr>
         <w:pStyle w:val="4"/>
-        <w:rPr>
-          <w:lang w:val="ko-KR"/>
-        </w:rPr>
-      </w:pPr>
-      <w:proofErr w:type="spellStart"/>
-      <w:r>
-        <w:rPr>
-          <w:lang w:val="ko-KR"/>
-        </w:rPr>
-        <w:t>r</w:t>
-      </w:r>
-      <w:r>
-        <w:rPr>
-          <w:lang w:val="ko-KR"/>
-        </w:rPr>
-        <w:t>esolution</w:t>
-      </w:r>
-      <w:proofErr w:type="spellEnd"/>
+      </w:pPr>
+      <w:r>
+        <w:t>b</w:t>
+      </w:r>
+      <w:r>
+        <w:t>lurring</w:t>
+      </w:r>
     </w:p>
     <w:p>
       <w:pPr>
         <w:pStyle w:val="5"/>
-        <w:rPr>
-          <w:lang w:val="ko-KR"/>
-        </w:rPr>
-      </w:pPr>
-      <w:proofErr w:type="spellStart"/>
-      <w:r>
-        <w:rPr>
-          <w:rFonts w:hint="eastAsia"/>
-          <w:lang w:val="ko-KR"/>
+      </w:pPr>
+      <w:r>
+        <w:rPr>
+          <w:rFonts w:hint="eastAsia"/>
         </w:rPr>
         <w:t>T</w:t>
       </w:r>
       <w:r>
-        <w:rPr>
-          <w:lang w:val="ko-KR"/>
-        </w:rPr>
-        <w:t>ype</w:t>
-      </w:r>
-      <w:proofErr w:type="spellEnd"/>
-      <w:r>
-        <w:rPr>
-          <w:lang w:val="ko-KR"/>
-        </w:rPr>
-        <w:t xml:space="preserve">: </w:t>
-      </w:r>
-      <w:proofErr w:type="spellStart"/>
-      <w:r>
-        <w:rPr>
-          <w:lang w:val="ko-KR"/>
-        </w:rPr>
-        <w:t>int</w:t>
-      </w:r>
-      <w:proofErr w:type="spellEnd"/>
-      <w:r>
-        <w:rPr>
-          <w:lang w:val="ko-KR"/>
-        </w:rPr>
-        <w:t xml:space="preserve"> (</w:t>
-      </w:r>
-      <w:r>
-        <w:rPr>
-          <w:lang w:val="ko-KR"/>
-        </w:rPr>
-        <w:t>32~1024)</w:t>
+        <w:t>ype: int (</w:t>
+      </w:r>
+      <w:r>
+        <w:t>1</w:t>
+      </w:r>
+      <w:r>
+        <w:t>~</w:t>
+      </w:r>
+      <w:r>
+        <w:t>31</w:t>
+      </w:r>
+      <w:r>
+        <w:t>)</w:t>
       </w:r>
     </w:p>
     <w:p>
       <w:pPr>
         <w:pStyle w:val="5"/>
-        <w:rPr>
-          <w:lang w:val="ko-KR"/>
-        </w:rPr>
-      </w:pPr>
-      <w:r>
-        <w:rPr>
-          <w:rFonts w:hint="eastAsia"/>
-        </w:rPr>
-        <w:t xml:space="preserve">default </w:t>
-      </w:r>
-      <w:r>
-        <w:t>value</w:t>
-      </w:r>
-      <w:r>
-        <w:rPr>
-          <w:lang w:val="ko-KR"/>
-        </w:rPr>
-        <w:t xml:space="preserve">: </w:t>
-      </w:r>
-      <w:r>
-        <w:rPr>
-          <w:lang w:val="ko-KR"/>
-        </w:rPr>
-        <w:t>256</w:t>
+      </w:pPr>
+      <w:r>
+        <w:rPr>
+          <w:rFonts w:hint="eastAsia"/>
+        </w:rPr>
+        <w:t>default value:</w:t>
+      </w:r>
+      <w:r>
+        <w:t xml:space="preserve"> 1</w:t>
       </w:r>
     </w:p>
     <w:p>
@@ -627,11 +1135,7 @@
     </w:p>
     <w:p>
       <w:pPr>
-        <w:pStyle w:val="5"/>
-        <w:numPr>
-          <w:ilvl w:val="4"/>
-          <w:numId w:val="39"/>
-        </w:numPr>
+        <w:pStyle w:val="6"/>
       </w:pPr>
       <w:r>
         <w:rPr>
@@ -645,11 +1149,7 @@
     </w:p>
     <w:p>
       <w:pPr>
-        <w:pStyle w:val="5"/>
-        <w:numPr>
-          <w:ilvl w:val="4"/>
-          <w:numId w:val="39"/>
-        </w:numPr>
+        <w:pStyle w:val="6"/>
       </w:pPr>
       <w:r>
         <w:rPr>
@@ -658,740 +1158,12 @@
         <w:t>d</w:t>
       </w:r>
       <w:r>
-        <w:t xml:space="preserve">efault value: </w:t>
-      </w:r>
-      <w:r>
-        <w:t>3</w:t>
-      </w:r>
-    </w:p>
-    <w:p>
-      <w:pPr>
-        <w:pStyle w:val="5"/>
-        <w:numPr>
-          <w:ilvl w:val="4"/>
-          <w:numId w:val="39"/>
-        </w:numPr>
-        <w:rPr>
-          <w:rFonts w:hint="eastAsia"/>
-          <w:lang w:val="ko-KR"/>
-        </w:rPr>
-      </w:pPr>
-      <w:r>
-        <w:rPr>
-          <w:rFonts w:hint="eastAsia"/>
-        </w:rPr>
-        <w:t>R</w:t>
-      </w:r>
-      <w:r>
-        <w:t>ange: 1 ~ 10</w:t>
-      </w:r>
-    </w:p>
-    <w:p>
-      <w:pPr>
-        <w:pStyle w:val="4"/>
-        <w:rPr>
-          <w:lang w:val="ko-KR"/>
-        </w:rPr>
-      </w:pPr>
-      <w:proofErr w:type="spellStart"/>
-      <w:r>
-        <w:rPr>
-          <w:lang w:val="ko-KR"/>
-        </w:rPr>
-        <w:t>b</w:t>
-      </w:r>
-      <w:r>
-        <w:rPr>
-          <w:lang w:val="ko-KR"/>
-        </w:rPr>
-        <w:t>lurring</w:t>
-      </w:r>
-      <w:proofErr w:type="spellEnd"/>
-    </w:p>
-    <w:p>
-      <w:pPr>
-        <w:pStyle w:val="5"/>
-        <w:rPr>
-          <w:lang w:val="ko-KR"/>
-        </w:rPr>
-      </w:pPr>
-      <w:proofErr w:type="spellStart"/>
-      <w:r>
-        <w:rPr>
-          <w:rFonts w:hint="eastAsia"/>
-          <w:lang w:val="ko-KR"/>
-        </w:rPr>
-        <w:t>T</w:t>
-      </w:r>
-      <w:r>
-        <w:rPr>
-          <w:lang w:val="ko-KR"/>
-        </w:rPr>
-        <w:t>ype</w:t>
-      </w:r>
-      <w:proofErr w:type="spellEnd"/>
-      <w:r>
-        <w:rPr>
-          <w:lang w:val="ko-KR"/>
-        </w:rPr>
-        <w:t xml:space="preserve">: </w:t>
-      </w:r>
-      <w:proofErr w:type="spellStart"/>
-      <w:r>
-        <w:rPr>
-          <w:lang w:val="ko-KR"/>
-        </w:rPr>
-        <w:t>int</w:t>
-      </w:r>
-      <w:proofErr w:type="spellEnd"/>
-      <w:r>
-        <w:rPr>
-          <w:lang w:val="ko-KR"/>
-        </w:rPr>
-        <w:t xml:space="preserve"> (1~31)</w:t>
-      </w:r>
-    </w:p>
-    <w:p>
-      <w:pPr>
-        <w:pStyle w:val="5"/>
-        <w:rPr>
-          <w:lang w:val="ko-KR"/>
-        </w:rPr>
-      </w:pPr>
-      <w:r>
-        <w:rPr>
-          <w:rFonts w:hint="eastAsia"/>
-        </w:rPr>
-        <w:t xml:space="preserve">default </w:t>
-      </w:r>
-      <w:r>
-        <w:t>value</w:t>
-      </w:r>
-      <w:r>
-        <w:rPr>
-          <w:lang w:val="ko-KR"/>
-        </w:rPr>
-        <w:t xml:space="preserve">: </w:t>
-      </w:r>
-      <w:r>
-        <w:rPr>
-          <w:lang w:val="ko-KR"/>
-        </w:rPr>
-        <w:t>1</w:t>
-      </w:r>
-    </w:p>
-    <w:p>
-      <w:pPr>
-        <w:pStyle w:val="5"/>
-      </w:pPr>
-      <w:r>
-        <w:t xml:space="preserve">UI </w:t>
-      </w:r>
-      <w:r>
-        <w:rPr>
-          <w:rFonts w:hint="eastAsia"/>
-        </w:rPr>
-        <w:t>설정</w:t>
+        <w:t>efault value: 1</w:t>
       </w:r>
     </w:p>
     <w:p>
       <w:pPr>
         <w:pStyle w:val="6"/>
-      </w:pPr>
-      <w:r>
-        <w:rPr>
-          <w:rFonts w:hint="eastAsia"/>
-        </w:rPr>
-        <w:t>T</w:t>
-      </w:r>
-      <w:r>
-        <w:t>ype: slide</w:t>
-      </w:r>
-    </w:p>
-    <w:p>
-      <w:pPr>
-        <w:pStyle w:val="5"/>
-        <w:numPr>
-          <w:ilvl w:val="4"/>
-          <w:numId w:val="39"/>
-        </w:numPr>
-      </w:pPr>
-      <w:r>
-        <w:rPr>
-          <w:rFonts w:hint="eastAsia"/>
-        </w:rPr>
-        <w:t>d</w:t>
-      </w:r>
-      <w:r>
-        <w:t xml:space="preserve">efault value: </w:t>
-      </w:r>
-      <w:r>
-        <w:t>1</w:t>
-      </w:r>
-    </w:p>
-    <w:p>
-      <w:pPr>
-        <w:pStyle w:val="5"/>
-        <w:numPr>
-          <w:ilvl w:val="4"/>
-          <w:numId w:val="39"/>
-        </w:numPr>
-        <w:rPr>
-          <w:lang w:val="ko-KR"/>
-        </w:rPr>
-      </w:pPr>
-      <w:r>
-        <w:rPr>
-          <w:rFonts w:hint="eastAsia"/>
-        </w:rPr>
-        <w:t>R</w:t>
-      </w:r>
-      <w:r>
-        <w:t xml:space="preserve">ange: 1 ~ </w:t>
-      </w:r>
-      <w:r>
-        <w:t>10</w:t>
-      </w:r>
-    </w:p>
-    <w:p>
-      <w:pPr>
-        <w:pStyle w:val="4"/>
-        <w:rPr>
-          <w:lang w:val="ko-KR"/>
-        </w:rPr>
-      </w:pPr>
-      <w:proofErr w:type="spellStart"/>
-      <w:r>
-        <w:rPr>
-          <w:lang w:val="ko-KR"/>
-        </w:rPr>
-        <w:t>Ignore</w:t>
-      </w:r>
-      <w:proofErr w:type="spellEnd"/>
-      <w:r>
-        <w:rPr>
-          <w:lang w:val="ko-KR"/>
-        </w:rPr>
-        <w:t xml:space="preserve"> </w:t>
-      </w:r>
-      <w:proofErr w:type="spellStart"/>
-      <w:r>
-        <w:rPr>
-          <w:lang w:val="ko-KR"/>
-        </w:rPr>
-        <w:t>Transparency</w:t>
-      </w:r>
-      <w:proofErr w:type="spellEnd"/>
-    </w:p>
-    <w:p>
-      <w:pPr>
-        <w:pStyle w:val="5"/>
-        <w:rPr>
-          <w:lang w:val="ko-KR"/>
-        </w:rPr>
-      </w:pPr>
-      <w:proofErr w:type="spellStart"/>
-      <w:r>
-        <w:rPr>
-          <w:rFonts w:hint="eastAsia"/>
-          <w:lang w:val="ko-KR"/>
-        </w:rPr>
-        <w:t>T</w:t>
-      </w:r>
-      <w:r>
-        <w:rPr>
-          <w:lang w:val="ko-KR"/>
-        </w:rPr>
-        <w:t>ype</w:t>
-      </w:r>
-      <w:proofErr w:type="spellEnd"/>
-      <w:r>
-        <w:rPr>
-          <w:lang w:val="ko-KR"/>
-        </w:rPr>
-        <w:t>: bool</w:t>
-      </w:r>
-    </w:p>
-    <w:p>
-      <w:pPr>
-        <w:pStyle w:val="5"/>
-        <w:rPr>
-          <w:lang w:val="ko-KR"/>
-        </w:rPr>
-      </w:pPr>
-      <w:r>
-        <w:rPr>
-          <w:rFonts w:hint="eastAsia"/>
-        </w:rPr>
-        <w:t xml:space="preserve">default </w:t>
-      </w:r>
-      <w:r>
-        <w:t>value</w:t>
-      </w:r>
-      <w:r>
-        <w:rPr>
-          <w:lang w:val="ko-KR"/>
-        </w:rPr>
-        <w:t xml:space="preserve">: </w:t>
-      </w:r>
-      <w:proofErr w:type="spellStart"/>
-      <w:r>
-        <w:rPr>
-          <w:lang w:val="ko-KR"/>
-        </w:rPr>
-        <w:t>false</w:t>
-      </w:r>
-      <w:proofErr w:type="spellEnd"/>
-    </w:p>
-    <w:p>
-      <w:pPr>
-        <w:pStyle w:val="4"/>
-        <w:rPr>
-          <w:lang w:val="ko-KR"/>
-        </w:rPr>
-      </w:pPr>
-      <w:proofErr w:type="spellStart"/>
-      <w:r>
-        <w:rPr>
-          <w:lang w:val="ko-KR"/>
-        </w:rPr>
-        <w:t>color</w:t>
-      </w:r>
-      <w:proofErr w:type="spellEnd"/>
-    </w:p>
-    <w:p>
-      <w:pPr>
-        <w:pStyle w:val="5"/>
-        <w:rPr>
-          <w:lang w:val="ko-KR"/>
-        </w:rPr>
-      </w:pPr>
-      <w:proofErr w:type="spellStart"/>
-      <w:r>
-        <w:rPr>
-          <w:rFonts w:hint="eastAsia"/>
-          <w:lang w:val="ko-KR"/>
-        </w:rPr>
-        <w:t>T</w:t>
-      </w:r>
-      <w:r>
-        <w:rPr>
-          <w:lang w:val="ko-KR"/>
-        </w:rPr>
-        <w:t>ype</w:t>
-      </w:r>
-      <w:proofErr w:type="spellEnd"/>
-      <w:r>
-        <w:rPr>
-          <w:lang w:val="ko-KR"/>
-        </w:rPr>
-        <w:t xml:space="preserve">: </w:t>
-      </w:r>
-      <w:proofErr w:type="spellStart"/>
-      <w:r>
-        <w:rPr>
-          <w:lang w:val="ko-KR"/>
-        </w:rPr>
-        <w:t>RGB</w:t>
-      </w:r>
-      <w:r>
-        <w:rPr>
-          <w:lang w:val="ko-KR"/>
-        </w:rPr>
-        <w:t>A</w:t>
-      </w:r>
-      <w:r>
-        <w:rPr>
-          <w:lang w:val="ko-KR"/>
-        </w:rPr>
-        <w:t>Color</w:t>
-      </w:r>
-      <w:proofErr w:type="spellEnd"/>
-    </w:p>
-    <w:p>
-      <w:pPr>
-        <w:pStyle w:val="5"/>
-      </w:pPr>
-      <w:r>
-        <w:rPr>
-          <w:rFonts w:hint="eastAsia"/>
-        </w:rPr>
-        <w:t xml:space="preserve">default </w:t>
-      </w:r>
-      <w:r>
-        <w:t xml:space="preserve">value: </w:t>
-      </w:r>
-      <w:proofErr w:type="spellStart"/>
-      <w:proofErr w:type="gramStart"/>
-      <w:r>
-        <w:t>RGBAColor</w:t>
-      </w:r>
-      <w:proofErr w:type="spellEnd"/>
-      <w:r>
-        <w:t>(</w:t>
-      </w:r>
-      <w:proofErr w:type="gramEnd"/>
-      <w:r>
-        <w:t>0.</w:t>
-      </w:r>
-      <w:r>
-        <w:t>25f, 0.25f</w:t>
-      </w:r>
-      <w:r>
-        <w:t xml:space="preserve">, </w:t>
-      </w:r>
-      <w:r>
-        <w:t>0.25f</w:t>
-      </w:r>
-      <w:r>
-        <w:t>)</w:t>
-      </w:r>
-    </w:p>
-    <w:p>
-      <w:pPr>
-        <w:pStyle w:val="4"/>
-      </w:pPr>
-      <w:r>
-        <w:t>o</w:t>
-      </w:r>
-      <w:r>
-        <w:t>pacity</w:t>
-      </w:r>
-    </w:p>
-    <w:p>
-      <w:pPr>
-        <w:pStyle w:val="5"/>
-      </w:pPr>
-      <w:r>
-        <w:rPr>
-          <w:rFonts w:hint="eastAsia"/>
-        </w:rPr>
-        <w:t>T</w:t>
-      </w:r>
-      <w:r>
-        <w:t>ype: float</w:t>
-      </w:r>
-      <w:r>
-        <w:t xml:space="preserve"> (0~1)</w:t>
-      </w:r>
-    </w:p>
-    <w:p>
-      <w:pPr>
-        <w:pStyle w:val="5"/>
-      </w:pPr>
-      <w:r>
-        <w:t xml:space="preserve">default value: </w:t>
-      </w:r>
-      <w:r>
-        <w:t>1.0f</w:t>
-      </w:r>
-    </w:p>
-    <w:p>
-      <w:pPr>
-        <w:pStyle w:val="5"/>
-      </w:pPr>
-      <w:r>
-        <w:t xml:space="preserve">UI </w:t>
-      </w:r>
-      <w:r>
-        <w:rPr>
-          <w:rFonts w:hint="eastAsia"/>
-        </w:rPr>
-        <w:t>설정</w:t>
-      </w:r>
-    </w:p>
-    <w:p>
-      <w:pPr>
-        <w:pStyle w:val="5"/>
-        <w:numPr>
-          <w:ilvl w:val="4"/>
-          <w:numId w:val="39"/>
-        </w:numPr>
-      </w:pPr>
-      <w:r>
-        <w:rPr>
-          <w:rFonts w:hint="eastAsia"/>
-        </w:rPr>
-        <w:t>T</w:t>
-      </w:r>
-      <w:r>
-        <w:t>ype: slide</w:t>
-      </w:r>
-    </w:p>
-    <w:p>
-      <w:pPr>
-        <w:pStyle w:val="5"/>
-        <w:numPr>
-          <w:ilvl w:val="4"/>
-          <w:numId w:val="39"/>
-        </w:numPr>
-      </w:pPr>
-      <w:r>
-        <w:rPr>
-          <w:rFonts w:hint="eastAsia"/>
-        </w:rPr>
-        <w:t>d</w:t>
-      </w:r>
-      <w:r>
-        <w:t>efault value: 10</w:t>
-      </w:r>
-    </w:p>
-    <w:p>
-      <w:pPr>
-        <w:pStyle w:val="5"/>
-        <w:numPr>
-          <w:ilvl w:val="4"/>
-          <w:numId w:val="39"/>
-        </w:numPr>
-      </w:pPr>
-      <w:r>
-        <w:rPr>
-          <w:rFonts w:hint="eastAsia"/>
-        </w:rPr>
-        <w:t>R</w:t>
-      </w:r>
-      <w:r>
-        <w:t xml:space="preserve">ange: 1 ~ </w:t>
-      </w:r>
-      <w:r>
-        <w:t>1</w:t>
-      </w:r>
-      <w:r>
-        <w:t>0</w:t>
-      </w:r>
-    </w:p>
-    <w:p>
-      <w:pPr>
-        <w:pStyle w:val="3"/>
-      </w:pPr>
-      <w:r>
-        <w:t>Reflection</w:t>
-      </w:r>
-      <w:r>
-        <w:t xml:space="preserve"> </w:t>
-      </w:r>
-      <w:r>
-        <w:t>Plane</w:t>
-      </w:r>
-    </w:p>
-    <w:p>
-      <w:pPr>
-        <w:pStyle w:val="4"/>
-      </w:pPr>
-      <w:r>
-        <w:t>o</w:t>
-      </w:r>
-      <w:r>
-        <w:t>pacity</w:t>
-      </w:r>
-    </w:p>
-    <w:p>
-      <w:pPr>
-        <w:pStyle w:val="5"/>
-      </w:pPr>
-      <w:r>
-        <w:rPr>
-          <w:rFonts w:hint="eastAsia"/>
-        </w:rPr>
-        <w:t>T</w:t>
-      </w:r>
-      <w:r>
-        <w:t>ype: float (0~1)</w:t>
-      </w:r>
-    </w:p>
-    <w:p>
-      <w:pPr>
-        <w:pStyle w:val="5"/>
-      </w:pPr>
-      <w:r>
-        <w:t>default value: 0.5f</w:t>
-      </w:r>
-    </w:p>
-    <w:p>
-      <w:pPr>
-        <w:pStyle w:val="5"/>
-      </w:pPr>
-      <w:r>
-        <w:t xml:space="preserve">UI </w:t>
-      </w:r>
-      <w:r>
-        <w:rPr>
-          <w:rFonts w:hint="eastAsia"/>
-        </w:rPr>
-        <w:t>설정</w:t>
-      </w:r>
-    </w:p>
-    <w:p>
-      <w:pPr>
-        <w:pStyle w:val="5"/>
-        <w:numPr>
-          <w:ilvl w:val="4"/>
-          <w:numId w:val="39"/>
-        </w:numPr>
-      </w:pPr>
-      <w:r>
-        <w:rPr>
-          <w:rFonts w:hint="eastAsia"/>
-        </w:rPr>
-        <w:t>T</w:t>
-      </w:r>
-      <w:r>
-        <w:t>ype: slide</w:t>
-      </w:r>
-    </w:p>
-    <w:p>
-      <w:pPr>
-        <w:pStyle w:val="5"/>
-        <w:numPr>
-          <w:ilvl w:val="4"/>
-          <w:numId w:val="39"/>
-        </w:numPr>
-      </w:pPr>
-      <w:r>
-        <w:rPr>
-          <w:rFonts w:hint="eastAsia"/>
-        </w:rPr>
-        <w:t>d</w:t>
-      </w:r>
-      <w:r>
-        <w:t xml:space="preserve">efault value: </w:t>
-      </w:r>
-      <w:r>
-        <w:t>5</w:t>
-      </w:r>
-    </w:p>
-    <w:p>
-      <w:pPr>
-        <w:pStyle w:val="5"/>
-        <w:numPr>
-          <w:ilvl w:val="4"/>
-          <w:numId w:val="39"/>
-        </w:numPr>
-      </w:pPr>
-      <w:r>
-        <w:rPr>
-          <w:rFonts w:hint="eastAsia"/>
-        </w:rPr>
-        <w:t>R</w:t>
-      </w:r>
-      <w:r>
-        <w:t>ange: 1 ~ 10</w:t>
-      </w:r>
-    </w:p>
-    <w:p>
-      <w:pPr>
-        <w:pStyle w:val="4"/>
-      </w:pPr>
-      <w:r>
-        <w:t>b</w:t>
-      </w:r>
-      <w:r>
-        <w:t>lurring</w:t>
-      </w:r>
-    </w:p>
-    <w:p>
-      <w:pPr>
-        <w:pStyle w:val="5"/>
-      </w:pPr>
-      <w:r>
-        <w:rPr>
-          <w:rFonts w:hint="eastAsia"/>
-        </w:rPr>
-        <w:t>T</w:t>
-      </w:r>
-      <w:r>
-        <w:t>ype: int (</w:t>
-      </w:r>
-      <w:r>
-        <w:t>1</w:t>
-      </w:r>
-      <w:r>
-        <w:t>~</w:t>
-      </w:r>
-      <w:r>
-        <w:t>31</w:t>
-      </w:r>
-      <w:r>
-        <w:t>)</w:t>
-      </w:r>
-    </w:p>
-    <w:p>
-      <w:pPr>
-        <w:pStyle w:val="5"/>
-      </w:pPr>
-      <w:r>
-        <w:rPr>
-          <w:rFonts w:hint="eastAsia"/>
-        </w:rPr>
-        <w:t>default value:</w:t>
-      </w:r>
-      <w:r>
-        <w:t xml:space="preserve"> 1</w:t>
-      </w:r>
-    </w:p>
-    <w:p>
-      <w:pPr>
-        <w:pStyle w:val="5"/>
-      </w:pPr>
-      <w:r>
-        <w:t xml:space="preserve">UI </w:t>
-      </w:r>
-      <w:r>
-        <w:rPr>
-          <w:rFonts w:hint="eastAsia"/>
-        </w:rPr>
-        <w:t>설정</w:t>
-      </w:r>
-    </w:p>
-    <w:p>
-      <w:pPr>
-        <w:pStyle w:val="5"/>
-        <w:numPr>
-          <w:ilvl w:val="4"/>
-          <w:numId w:val="39"/>
-        </w:numPr>
-      </w:pPr>
-      <w:r>
-        <w:rPr>
-          <w:rFonts w:hint="eastAsia"/>
-        </w:rPr>
-        <w:t>T</w:t>
-      </w:r>
-      <w:r>
-        <w:t>ype: slide</w:t>
-      </w:r>
-    </w:p>
-    <w:p>
-      <w:pPr>
-        <w:pStyle w:val="5"/>
-        <w:numPr>
-          <w:ilvl w:val="4"/>
-          <w:numId w:val="39"/>
-        </w:numPr>
-      </w:pPr>
-      <w:r>
-        <w:rPr>
-          <w:rFonts w:hint="eastAsia"/>
-        </w:rPr>
-        <w:t>d</w:t>
-      </w:r>
-      <w:r>
-        <w:t xml:space="preserve">efault value: </w:t>
-      </w:r>
-      <w:r>
-        <w:t>1</w:t>
-      </w:r>
-    </w:p>
-    <w:p>
-      <w:pPr>
-        <w:pStyle w:val="5"/>
-        <w:numPr>
-          <w:ilvl w:val="4"/>
-          <w:numId w:val="39"/>
-        </w:numPr>
-        <w:rPr>
-          <w:rFonts w:hint="eastAsia"/>
-        </w:rPr>
       </w:pPr>
       <w:r>
         <w:rPr>
@@ -1444,14 +1216,12 @@
           <w:strike/>
         </w:rPr>
       </w:pPr>
-      <w:proofErr w:type="spellStart"/>
       <w:r>
         <w:rPr>
           <w:strike/>
         </w:rPr>
         <w:t>AttenuationNearDistance</w:t>
       </w:r>
-      <w:proofErr w:type="spellEnd"/>
     </w:p>
     <w:p>
       <w:pPr>
@@ -1487,9 +1257,6 @@
     <w:p>
       <w:pPr>
         <w:pStyle w:val="5"/>
-        <w:rPr>
-          <w:rFonts w:hint="eastAsia"/>
-        </w:rPr>
       </w:pPr>
       <w:r>
         <w:t xml:space="preserve">UI </w:t>
@@ -1523,14 +1290,12 @@
           <w:strike/>
         </w:rPr>
       </w:pPr>
-      <w:proofErr w:type="spellStart"/>
       <w:r>
         <w:rPr>
           <w:strike/>
         </w:rPr>
         <w:t>AttenuationFarDistance</w:t>
       </w:r>
-      <w:proofErr w:type="spellEnd"/>
     </w:p>
     <w:p>
       <w:pPr>
@@ -1563,9 +1328,6 @@
     <w:p>
       <w:pPr>
         <w:pStyle w:val="5"/>
-        <w:rPr>
-          <w:rFonts w:hint="eastAsia"/>
-        </w:rPr>
       </w:pPr>
       <w:r>
         <w:t xml:space="preserve">UI </w:t>
@@ -1593,28 +1355,24 @@
           <w:lang w:val="ko-KR"/>
         </w:rPr>
       </w:pPr>
-      <w:proofErr w:type="spellStart"/>
       <w:r>
         <w:rPr>
           <w:lang w:val="ko-KR"/>
         </w:rPr>
         <w:t>Ambient</w:t>
       </w:r>
-      <w:proofErr w:type="spellEnd"/>
       <w:r>
         <w:rPr>
           <w:lang w:val="ko-KR"/>
         </w:rPr>
         <w:t xml:space="preserve"> </w:t>
       </w:r>
-      <w:proofErr w:type="spellStart"/>
       <w:r>
         <w:rPr>
           <w:lang w:val="ko-KR"/>
         </w:rPr>
         <w:t>Occlusion</w:t>
       </w:r>
-      <w:proofErr w:type="spellEnd"/>
     </w:p>
     <w:p>
       <w:pPr>
@@ -1623,7 +1381,6 @@
           <w:lang w:val="ko-KR"/>
         </w:rPr>
       </w:pPr>
-      <w:proofErr w:type="spellStart"/>
       <w:r>
         <w:rPr>
           <w:lang w:val="ko-KR"/>
@@ -1636,7 +1393,6 @@
         </w:rPr>
         <w:t>trength</w:t>
       </w:r>
-      <w:proofErr w:type="spellEnd"/>
     </w:p>
     <w:p>
       <w:pPr>
@@ -1645,45 +1401,587 @@
           <w:lang w:val="ko-KR"/>
         </w:rPr>
       </w:pPr>
-      <w:proofErr w:type="spellStart"/>
-      <w:r>
-        <w:rPr>
-          <w:lang w:val="ko-KR"/>
-        </w:rPr>
-        <w:t>Type</w:t>
-      </w:r>
-      <w:proofErr w:type="spellEnd"/>
-      <w:r>
-        <w:rPr>
-          <w:lang w:val="ko-KR"/>
-        </w:rPr>
+      <w:r>
+        <w:rPr>
+          <w:lang w:val="ko-KR"/>
+        </w:rPr>
+        <w:t xml:space="preserve">Type: </w:t>
+      </w:r>
+      <w:r>
+        <w:rPr>
+          <w:lang w:val="ko-KR"/>
+        </w:rPr>
+        <w:t>float</w:t>
+      </w:r>
+      <w:r>
+        <w:rPr>
+          <w:lang w:val="ko-KR"/>
+        </w:rPr>
+        <w:t xml:space="preserve"> (1 - </w:t>
+      </w:r>
+      <w:r>
+        <w:rPr>
+          <w:lang w:val="ko-KR"/>
+        </w:rPr>
+        <w:t>100</w:t>
+      </w:r>
+      <w:r>
+        <w:rPr>
+          <w:lang w:val="ko-KR"/>
+        </w:rPr>
+        <w:t>)</w:t>
+      </w:r>
+    </w:p>
+    <w:p>
+      <w:pPr>
+        <w:pStyle w:val="5"/>
+        <w:rPr>
+          <w:lang w:val="ko-KR"/>
+        </w:rPr>
+      </w:pPr>
+      <w:r>
+        <w:rPr>
+          <w:rFonts w:hint="eastAsia"/>
+        </w:rPr>
+        <w:t xml:space="preserve">default </w:t>
+      </w:r>
+      <w:r>
+        <w:t>value</w:t>
+      </w:r>
+      <w:r>
+        <w:rPr>
+          <w:lang w:val="ko-KR"/>
+        </w:rPr>
+        <w:t>:</w:t>
+      </w:r>
+      <w:r>
+        <w:rPr>
+          <w:lang w:val="ko-KR"/>
+        </w:rPr>
+        <w:t xml:space="preserve"> </w:t>
+      </w:r>
+      <w:r>
+        <w:rPr>
+          <w:lang w:val="ko-KR"/>
+        </w:rPr>
+        <w:t>1</w:t>
+      </w:r>
+      <w:r>
+        <w:rPr>
+          <w:lang w:val="ko-KR"/>
+        </w:rPr>
+        <w:t>.0f</w:t>
+      </w:r>
+    </w:p>
+    <w:p>
+      <w:pPr>
+        <w:pStyle w:val="5"/>
+      </w:pPr>
+      <w:r>
+        <w:t xml:space="preserve">UI </w:t>
+      </w:r>
+      <w:r>
+        <w:rPr>
+          <w:rFonts w:hint="eastAsia"/>
+        </w:rPr>
+        <w:t>설정</w:t>
+      </w:r>
+    </w:p>
+    <w:p>
+      <w:pPr>
+        <w:pStyle w:val="6"/>
+      </w:pPr>
+      <w:r>
+        <w:rPr>
+          <w:rFonts w:hint="eastAsia"/>
+        </w:rPr>
+        <w:t>T</w:t>
+      </w:r>
+      <w:r>
+        <w:t>ype: slide</w:t>
+      </w:r>
+    </w:p>
+    <w:p>
+      <w:pPr>
+        <w:pStyle w:val="6"/>
+      </w:pPr>
+      <w:r>
+        <w:rPr>
+          <w:rFonts w:hint="eastAsia"/>
+        </w:rPr>
+        <w:t>d</w:t>
+      </w:r>
+      <w:r>
+        <w:t>efault value: 1</w:t>
+      </w:r>
+    </w:p>
+    <w:p>
+      <w:pPr>
+        <w:pStyle w:val="6"/>
+        <w:rPr>
+          <w:lang w:val="ko-KR"/>
+        </w:rPr>
+      </w:pPr>
+      <w:r>
+        <w:rPr>
+          <w:rFonts w:hint="eastAsia"/>
+        </w:rPr>
+        <w:t>R</w:t>
+      </w:r>
+      <w:r>
+        <w:t xml:space="preserve">ange: 1 ~ </w:t>
+      </w:r>
+      <w:r>
+        <w:t>2</w:t>
+      </w:r>
+      <w:r>
+        <w:t>0</w:t>
+      </w:r>
+    </w:p>
+    <w:p>
+      <w:pPr>
+        <w:pStyle w:val="4"/>
+        <w:rPr>
+          <w:lang w:val="ko-KR"/>
+        </w:rPr>
+      </w:pPr>
+      <w:r>
+        <w:rPr>
+          <w:lang w:val="ko-KR"/>
+        </w:rPr>
+        <w:t>quality</w:t>
+      </w:r>
+    </w:p>
+    <w:p>
+      <w:pPr>
+        <w:pStyle w:val="5"/>
+        <w:rPr>
+          <w:lang w:val="ko-KR"/>
+        </w:rPr>
+      </w:pPr>
+      <w:r>
+        <w:rPr>
+          <w:rFonts w:hint="eastAsia"/>
+          <w:lang w:val="ko-KR"/>
+        </w:rPr>
+        <w:t>T</w:t>
+      </w:r>
+      <w:r>
+        <w:rPr>
+          <w:lang w:val="ko-KR"/>
+        </w:rPr>
+        <w:t>ype: string</w:t>
+      </w:r>
+      <w:r>
+        <w:rPr>
+          <w:lang w:val="ko-KR"/>
+        </w:rPr>
+        <w:t xml:space="preserve"> (</w:t>
+      </w:r>
+      <w:r>
+        <w:rPr>
+          <w:lang w:val="ko-KR"/>
+        </w:rPr>
+        <w:t>fast</w:t>
+      </w:r>
+      <w:r>
+        <w:rPr>
+          <w:lang w:val="ko-KR"/>
+        </w:rPr>
+        <w:t>, nicest)</w:t>
+      </w:r>
+    </w:p>
+    <w:p>
+      <w:pPr>
+        <w:pStyle w:val="5"/>
+        <w:rPr>
+          <w:lang w:val="ko-KR"/>
+        </w:rPr>
+      </w:pPr>
+      <w:r>
+        <w:rPr>
+          <w:rFonts w:hint="eastAsia"/>
+        </w:rPr>
+        <w:t xml:space="preserve">default </w:t>
+      </w:r>
+      <w:r>
+        <w:t>value</w:t>
+      </w:r>
+      <w:r>
+        <w:rPr>
+          <w:lang w:val="ko-KR"/>
+        </w:rPr>
+        <w:t>:</w:t>
+      </w:r>
+      <w:r>
+        <w:rPr>
+          <w:lang w:val="ko-KR"/>
+        </w:rPr>
+        <w:t xml:space="preserve"> </w:t>
+      </w:r>
+      <w:r>
+        <w:rPr>
+          <w:lang w:val="ko-KR"/>
+        </w:rPr>
+        <w:t>fast</w:t>
+      </w:r>
+    </w:p>
+    <w:p>
+      <w:pPr>
+        <w:pStyle w:val="5"/>
+      </w:pPr>
+      <w:r>
+        <w:t xml:space="preserve">UI </w:t>
+      </w:r>
+      <w:r>
+        <w:rPr>
+          <w:rFonts w:hint="eastAsia"/>
+        </w:rPr>
+        <w:t>설정</w:t>
+      </w:r>
+    </w:p>
+    <w:p>
+      <w:pPr>
+        <w:pStyle w:val="6"/>
+      </w:pPr>
+      <w:r>
+        <w:rPr>
+          <w:rFonts w:hint="eastAsia"/>
+        </w:rPr>
+        <w:t>T</w:t>
+      </w:r>
+      <w:r>
+        <w:t xml:space="preserve">ype: </w:t>
+      </w:r>
+      <w:r>
+        <w:rPr>
+          <w:rFonts w:hint="eastAsia"/>
+        </w:rPr>
+        <w:t>c</w:t>
+      </w:r>
+      <w:r>
+        <w:t>ombo box</w:t>
+      </w:r>
+    </w:p>
+    <w:p>
+      <w:pPr>
+        <w:pStyle w:val="6"/>
+      </w:pPr>
+      <w:r>
+        <w:rPr>
+          <w:rFonts w:hint="eastAsia"/>
+        </w:rPr>
+        <w:t>d</w:t>
+      </w:r>
+      <w:r>
+        <w:t xml:space="preserve">efault value: </w:t>
+      </w:r>
+      <w:r>
+        <w:t>F</w:t>
+      </w:r>
+      <w:r>
+        <w:t>ast</w:t>
+      </w:r>
+    </w:p>
+    <w:p>
+      <w:pPr>
+        <w:pStyle w:val="6"/>
+        <w:rPr>
+          <w:lang w:val="ko-KR"/>
+        </w:rPr>
+      </w:pPr>
+      <w:r>
+        <w:t>Value</w:t>
+      </w:r>
+      <w:r>
         <w:t xml:space="preserve">: </w:t>
       </w:r>
-      <w:proofErr w:type="spellStart"/>
+      <w:r>
+        <w:t>F</w:t>
+      </w:r>
+      <w:r>
+        <w:t xml:space="preserve">ast, </w:t>
+      </w:r>
+      <w:r>
+        <w:t>N</w:t>
+      </w:r>
+      <w:r>
+        <w:t>icest</w:t>
+      </w:r>
+    </w:p>
+    <w:p>
+      <w:pPr>
+        <w:pStyle w:val="3"/>
+        <w:rPr>
+          <w:lang w:val="ko-KR"/>
+        </w:rPr>
+      </w:pPr>
+      <w:r>
+        <w:rPr>
+          <w:lang w:val="ko-KR"/>
+        </w:rPr>
+        <w:t>Silhouette</w:t>
+      </w:r>
+      <w:r>
+        <w:rPr>
+          <w:lang w:val="ko-KR"/>
+        </w:rPr>
+        <w:t xml:space="preserve"> </w:t>
+      </w:r>
+      <w:r>
+        <w:rPr>
+          <w:lang w:val="ko-KR"/>
+        </w:rPr>
+        <w:t>Edges</w:t>
+      </w:r>
+    </w:p>
+    <w:p>
+      <w:pPr>
+        <w:pStyle w:val="4"/>
+      </w:pPr>
+      <w:r>
+        <w:t>tolerance</w:t>
+      </w:r>
+    </w:p>
+    <w:p>
+      <w:pPr>
+        <w:pStyle w:val="5"/>
+        <w:rPr>
+          <w:lang w:val="ko-KR"/>
+        </w:rPr>
+      </w:pPr>
+      <w:bookmarkStart w:id="2" w:name="_Hlk149837170"/>
+      <w:r>
+        <w:rPr>
+          <w:rFonts w:hint="eastAsia"/>
+          <w:lang w:val="ko-KR"/>
+        </w:rPr>
+        <w:t>T</w:t>
+      </w:r>
+      <w:r>
+        <w:rPr>
+          <w:lang w:val="ko-KR"/>
+        </w:rPr>
+        <w:t>ype: float</w:t>
+      </w:r>
+      <w:r>
+        <w:rPr>
+          <w:lang w:val="ko-KR"/>
+        </w:rPr>
+        <w:t xml:space="preserve"> (1 – 100)</w:t>
+      </w:r>
+    </w:p>
+    <w:p>
+      <w:pPr>
+        <w:pStyle w:val="5"/>
+        <w:rPr>
+          <w:lang w:val="ko-KR"/>
+        </w:rPr>
+      </w:pPr>
+      <w:r>
+        <w:rPr>
+          <w:rFonts w:hint="eastAsia"/>
+        </w:rPr>
+        <w:t xml:space="preserve">default </w:t>
+      </w:r>
+      <w:r>
+        <w:t>value</w:t>
+      </w:r>
+      <w:r>
+        <w:rPr>
+          <w:lang w:val="ko-KR"/>
+        </w:rPr>
+        <w:t>:</w:t>
+      </w:r>
+      <w:r>
+        <w:rPr>
+          <w:lang w:val="ko-KR"/>
+        </w:rPr>
+        <w:t xml:space="preserve"> 1.0f</w:t>
+      </w:r>
+      <w:bookmarkEnd w:id="2"/>
+    </w:p>
+    <w:p>
+      <w:pPr>
+        <w:pStyle w:val="5"/>
+      </w:pPr>
+      <w:r>
+        <w:t xml:space="preserve">UI </w:t>
+      </w:r>
+      <w:r>
+        <w:rPr>
+          <w:rFonts w:hint="eastAsia"/>
+        </w:rPr>
+        <w:t>설정</w:t>
+      </w:r>
+    </w:p>
+    <w:p>
+      <w:pPr>
+        <w:pStyle w:val="6"/>
+      </w:pPr>
+      <w:r>
+        <w:rPr>
+          <w:rFonts w:hint="eastAsia"/>
+        </w:rPr>
+        <w:t>T</w:t>
+      </w:r>
+      <w:r>
+        <w:t>ype: slide</w:t>
+      </w:r>
+    </w:p>
+    <w:p>
+      <w:pPr>
+        <w:pStyle w:val="6"/>
+      </w:pPr>
+      <w:r>
+        <w:rPr>
+          <w:rFonts w:hint="eastAsia"/>
+        </w:rPr>
+        <w:t>d</w:t>
+      </w:r>
+      <w:r>
+        <w:t>efault value: 1</w:t>
+      </w:r>
+    </w:p>
+    <w:p>
+      <w:pPr>
+        <w:pStyle w:val="6"/>
+        <w:rPr>
+          <w:lang w:val="ko-KR"/>
+        </w:rPr>
+      </w:pPr>
+      <w:r>
+        <w:rPr>
+          <w:rFonts w:hint="eastAsia"/>
+        </w:rPr>
+        <w:t>R</w:t>
+      </w:r>
+      <w:r>
+        <w:t>ange: 1 ~ 20</w:t>
+      </w:r>
+    </w:p>
+    <w:p>
+      <w:pPr>
+        <w:pStyle w:val="4"/>
+        <w:rPr>
+          <w:lang w:val="ko-KR"/>
+        </w:rPr>
+      </w:pPr>
+      <w:r>
+        <w:rPr>
+          <w:lang w:val="ko-KR"/>
+        </w:rPr>
+        <w:t>HeavyExterior</w:t>
+      </w:r>
+    </w:p>
+    <w:p>
+      <w:pPr>
+        <w:pStyle w:val="5"/>
+        <w:rPr>
+          <w:lang w:val="ko-KR"/>
+        </w:rPr>
+      </w:pPr>
+      <w:r>
+        <w:rPr>
+          <w:rFonts w:hint="eastAsia"/>
+          <w:lang w:val="ko-KR"/>
+        </w:rPr>
+        <w:t>T</w:t>
+      </w:r>
+      <w:r>
+        <w:rPr>
+          <w:lang w:val="ko-KR"/>
+        </w:rPr>
+        <w:t>ype: bool</w:t>
+      </w:r>
+    </w:p>
+    <w:p>
+      <w:pPr>
+        <w:pStyle w:val="5"/>
+        <w:rPr>
+          <w:lang w:val="ko-KR"/>
+        </w:rPr>
+      </w:pPr>
+      <w:r>
+        <w:rPr>
+          <w:rFonts w:hint="eastAsia"/>
+        </w:rPr>
+        <w:t xml:space="preserve">default </w:t>
+      </w:r>
+      <w:r>
+        <w:t>value</w:t>
+      </w:r>
+      <w:r>
+        <w:rPr>
+          <w:lang w:val="ko-KR"/>
+        </w:rPr>
+        <w:t>:</w:t>
+      </w:r>
+      <w:r>
+        <w:rPr>
+          <w:lang w:val="ko-KR"/>
+        </w:rPr>
+        <w:t xml:space="preserve"> </w:t>
+      </w:r>
+      <w:r>
+        <w:rPr>
+          <w:lang w:val="ko-KR"/>
+        </w:rPr>
+        <w:t>true</w:t>
+      </w:r>
+    </w:p>
+    <w:p>
+      <w:pPr>
+        <w:pStyle w:val="3"/>
+        <w:rPr>
+          <w:lang w:val="ko-KR"/>
+        </w:rPr>
+      </w:pPr>
+      <w:r>
+        <w:rPr>
+          <w:lang w:val="ko-KR"/>
+        </w:rPr>
+        <w:t>Bloom</w:t>
+      </w:r>
+    </w:p>
+    <w:p>
+      <w:pPr>
+        <w:pStyle w:val="4"/>
+        <w:rPr>
+          <w:lang w:val="ko-KR"/>
+        </w:rPr>
+      </w:pPr>
+      <w:r>
+        <w:rPr>
+          <w:lang w:val="ko-KR"/>
+        </w:rPr>
+        <w:t>strength</w:t>
+      </w:r>
+    </w:p>
+    <w:p>
+      <w:pPr>
+        <w:pStyle w:val="5"/>
+        <w:rPr>
+          <w:lang w:val="ko-KR"/>
+        </w:rPr>
+      </w:pPr>
+      <w:r>
+        <w:rPr>
+          <w:lang w:val="ko-KR"/>
+        </w:rPr>
+        <w:t xml:space="preserve">Type: </w:t>
+      </w:r>
       <w:r>
         <w:rPr>
           <w:lang w:val="ko-KR"/>
         </w:rPr>
         <w:t>float</w:t>
       </w:r>
-      <w:proofErr w:type="spellEnd"/>
-      <w:r>
-        <w:rPr>
-          <w:lang w:val="ko-KR"/>
-        </w:rPr>
-        <w:t xml:space="preserve"> (1 - </w:t>
-      </w:r>
-      <w:r>
-        <w:rPr>
-          <w:lang w:val="ko-KR"/>
-        </w:rPr>
-        <w:t>100</w:t>
-      </w:r>
-      <w:r>
-        <w:rPr>
-          <w:lang w:val="ko-KR"/>
-        </w:rPr>
-        <w:t>)</w:t>
+      <w:r>
+        <w:rPr>
+          <w:lang w:val="ko-KR"/>
+        </w:rPr>
+        <w:t xml:space="preserve"> (1 - 10)</w:t>
       </w:r>
     </w:p>
     <w:p>
@@ -1743,765 +2041,83 @@
     </w:p>
     <w:p>
       <w:pPr>
+        <w:pStyle w:val="6"/>
+      </w:pPr>
+      <w:r>
+        <w:rPr>
+          <w:rFonts w:hint="eastAsia"/>
+        </w:rPr>
+        <w:t>T</w:t>
+      </w:r>
+      <w:r>
+        <w:t>ype: slide</w:t>
+      </w:r>
+    </w:p>
+    <w:p>
+      <w:pPr>
+        <w:pStyle w:val="6"/>
+      </w:pPr>
+      <w:r>
+        <w:rPr>
+          <w:rFonts w:hint="eastAsia"/>
+        </w:rPr>
+        <w:t>d</w:t>
+      </w:r>
+      <w:r>
+        <w:t>efault value: 1</w:t>
+      </w:r>
+    </w:p>
+    <w:p>
+      <w:pPr>
+        <w:pStyle w:val="6"/>
+        <w:rPr>
+          <w:lang w:val="ko-KR"/>
+        </w:rPr>
+      </w:pPr>
+      <w:r>
+        <w:rPr>
+          <w:rFonts w:hint="eastAsia"/>
+        </w:rPr>
+        <w:t>R</w:t>
+      </w:r>
+      <w:r>
+        <w:t>ange: 1 ~ 10</w:t>
+      </w:r>
+    </w:p>
+    <w:p>
+      <w:pPr>
+        <w:pStyle w:val="4"/>
+      </w:pPr>
+      <w:r>
+        <w:t>blur</w:t>
+      </w:r>
+    </w:p>
+    <w:p>
+      <w:pPr>
         <w:pStyle w:val="5"/>
-        <w:numPr>
-          <w:ilvl w:val="4"/>
-          <w:numId w:val="39"/>
-        </w:numPr>
-      </w:pPr>
-      <w:r>
-        <w:rPr>
-          <w:rFonts w:hint="eastAsia"/>
+        <w:rPr>
+          <w:lang w:val="ko-KR"/>
+        </w:rPr>
+      </w:pPr>
+      <w:r>
+        <w:rPr>
+          <w:rFonts w:hint="eastAsia"/>
+          <w:lang w:val="ko-KR"/>
         </w:rPr>
         <w:t>T</w:t>
       </w:r>
       <w:r>
-        <w:t>ype: slide</w:t>
-      </w:r>
-    </w:p>
-    <w:p>
-      <w:pPr>
-        <w:pStyle w:val="5"/>
-        <w:numPr>
-          <w:ilvl w:val="4"/>
-          <w:numId w:val="39"/>
-        </w:numPr>
-      </w:pPr>
-      <w:r>
-        <w:rPr>
-          <w:rFonts w:hint="eastAsia"/>
-        </w:rPr>
-        <w:t>d</w:t>
-      </w:r>
-      <w:r>
-        <w:t>efault value: 1</w:t>
-      </w:r>
-    </w:p>
-    <w:p>
-      <w:pPr>
-        <w:pStyle w:val="6"/>
-        <w:rPr>
-          <w:lang w:val="ko-KR"/>
-        </w:rPr>
-      </w:pPr>
-      <w:r>
-        <w:rPr>
-          <w:rFonts w:hint="eastAsia"/>
-        </w:rPr>
-        <w:t>R</w:t>
-      </w:r>
-      <w:r>
-        <w:t xml:space="preserve">ange: 1 ~ </w:t>
-      </w:r>
-      <w:r>
-        <w:t>2</w:t>
-      </w:r>
-      <w:r>
-        <w:t>0</w:t>
-      </w:r>
-    </w:p>
-    <w:p>
-      <w:pPr>
-        <w:pStyle w:val="4"/>
-        <w:rPr>
-          <w:lang w:val="ko-KR"/>
-        </w:rPr>
-      </w:pPr>
-      <w:proofErr w:type="spellStart"/>
-      <w:r>
-        <w:rPr>
-          <w:lang w:val="ko-KR"/>
-        </w:rPr>
-        <w:t>quality</w:t>
-      </w:r>
-      <w:proofErr w:type="spellEnd"/>
-    </w:p>
-    <w:p>
-      <w:pPr>
-        <w:pStyle w:val="5"/>
-        <w:rPr>
-          <w:lang w:val="ko-KR"/>
-        </w:rPr>
-      </w:pPr>
-      <w:proofErr w:type="spellStart"/>
-      <w:r>
-        <w:rPr>
-          <w:rFonts w:hint="eastAsia"/>
-          <w:lang w:val="ko-KR"/>
-        </w:rPr>
-        <w:t>T</w:t>
-      </w:r>
-      <w:r>
-        <w:rPr>
-          <w:lang w:val="ko-KR"/>
-        </w:rPr>
-        <w:t>ype</w:t>
-      </w:r>
-      <w:proofErr w:type="spellEnd"/>
-      <w:r>
-        <w:rPr>
-          <w:lang w:val="ko-KR"/>
-        </w:rPr>
-        <w:t xml:space="preserve">: </w:t>
-      </w:r>
-      <w:proofErr w:type="spellStart"/>
-      <w:r>
-        <w:rPr>
-          <w:lang w:val="ko-KR"/>
-        </w:rPr>
-        <w:t>string</w:t>
-      </w:r>
-      <w:proofErr w:type="spellEnd"/>
-      <w:r>
-        <w:rPr>
-          <w:lang w:val="ko-KR"/>
-        </w:rPr>
-        <w:t xml:space="preserve"> (</w:t>
-      </w:r>
-      <w:proofErr w:type="spellStart"/>
-      <w:r>
-        <w:rPr>
-          <w:lang w:val="ko-KR"/>
-        </w:rPr>
-        <w:t>fast</w:t>
-      </w:r>
-      <w:proofErr w:type="spellEnd"/>
-      <w:r>
-        <w:rPr>
-          <w:lang w:val="ko-KR"/>
-        </w:rPr>
-        <w:t xml:space="preserve">, </w:t>
-      </w:r>
-      <w:proofErr w:type="spellStart"/>
-      <w:r>
-        <w:rPr>
-          <w:lang w:val="ko-KR"/>
-        </w:rPr>
-        <w:t>nicest</w:t>
-      </w:r>
-      <w:proofErr w:type="spellEnd"/>
-      <w:r>
-        <w:rPr>
-          <w:lang w:val="ko-KR"/>
-        </w:rPr>
-        <w:t>)</w:t>
-      </w:r>
-    </w:p>
-    <w:p>
-      <w:pPr>
-        <w:pStyle w:val="5"/>
-        <w:rPr>
-          <w:lang w:val="ko-KR"/>
-        </w:rPr>
-      </w:pPr>
-      <w:r>
-        <w:rPr>
-          <w:rFonts w:hint="eastAsia"/>
-        </w:rPr>
-        <w:t xml:space="preserve">default </w:t>
-      </w:r>
-      <w:r>
-        <w:t>value</w:t>
-      </w:r>
-      <w:r>
-        <w:rPr>
-          <w:lang w:val="ko-KR"/>
-        </w:rPr>
-        <w:t>:</w:t>
-      </w:r>
-      <w:r>
-        <w:rPr>
-          <w:lang w:val="ko-KR"/>
-        </w:rPr>
-        <w:t xml:space="preserve"> </w:t>
-      </w:r>
-      <w:proofErr w:type="spellStart"/>
-      <w:r>
-        <w:rPr>
-          <w:lang w:val="ko-KR"/>
-        </w:rPr>
-        <w:t>fast</w:t>
-      </w:r>
-      <w:proofErr w:type="spellEnd"/>
-    </w:p>
-    <w:p>
-      <w:pPr>
-        <w:pStyle w:val="5"/>
-      </w:pPr>
-      <w:r>
-        <w:t xml:space="preserve">UI </w:t>
-      </w:r>
-      <w:r>
-        <w:rPr>
-          <w:rFonts w:hint="eastAsia"/>
-        </w:rPr>
-        <w:t>설정</w:t>
-      </w:r>
-    </w:p>
-    <w:p>
-      <w:pPr>
-        <w:pStyle w:val="5"/>
-        <w:numPr>
-          <w:ilvl w:val="4"/>
-          <w:numId w:val="39"/>
-        </w:numPr>
-      </w:pPr>
-      <w:r>
-        <w:rPr>
-          <w:rFonts w:hint="eastAsia"/>
-        </w:rPr>
-        <w:t>T</w:t>
-      </w:r>
-      <w:r>
+        <w:rPr>
+          <w:lang w:val="ko-KR"/>
+        </w:rPr>
         <w:t xml:space="preserve">ype: </w:t>
       </w:r>
       <w:r>
         <w:rPr>
-          <w:rFonts w:hint="eastAsia"/>
-        </w:rPr>
-        <w:t>c</w:t>
-      </w:r>
-      <w:r>
-        <w:t>ombo box</w:t>
-      </w:r>
-    </w:p>
-    <w:p>
-      <w:pPr>
-        <w:pStyle w:val="5"/>
-        <w:numPr>
-          <w:ilvl w:val="4"/>
-          <w:numId w:val="39"/>
-        </w:numPr>
-      </w:pPr>
-      <w:r>
-        <w:rPr>
-          <w:rFonts w:hint="eastAsia"/>
-        </w:rPr>
-        <w:t>d</w:t>
-      </w:r>
-      <w:r>
-        <w:t xml:space="preserve">efault value: </w:t>
-      </w:r>
-      <w:r>
-        <w:t>F</w:t>
-      </w:r>
-      <w:r>
-        <w:t>ast</w:t>
-      </w:r>
-    </w:p>
-    <w:p>
-      <w:pPr>
-        <w:pStyle w:val="6"/>
-        <w:rPr>
-          <w:lang w:val="ko-KR"/>
-        </w:rPr>
-      </w:pPr>
-      <w:r>
-        <w:t>Value</w:t>
-      </w:r>
-      <w:r>
-        <w:t xml:space="preserve">: </w:t>
-      </w:r>
-      <w:r>
-        <w:t>F</w:t>
-      </w:r>
-      <w:r>
-        <w:t xml:space="preserve">ast, </w:t>
-      </w:r>
-      <w:r>
-        <w:t>N</w:t>
-      </w:r>
-      <w:r>
-        <w:t>icest</w:t>
-      </w:r>
-    </w:p>
-    <w:p>
-      <w:pPr>
-        <w:pStyle w:val="3"/>
-        <w:rPr>
-          <w:lang w:val="ko-KR"/>
-        </w:rPr>
-      </w:pPr>
-      <w:proofErr w:type="spellStart"/>
-      <w:r>
-        <w:rPr>
-          <w:lang w:val="ko-KR"/>
-        </w:rPr>
-        <w:t>Silhouette</w:t>
-      </w:r>
-      <w:proofErr w:type="spellEnd"/>
-      <w:r>
-        <w:rPr>
-          <w:lang w:val="ko-KR"/>
-        </w:rPr>
-        <w:t xml:space="preserve"> </w:t>
-      </w:r>
-      <w:proofErr w:type="spellStart"/>
-      <w:r>
-        <w:rPr>
-          <w:lang w:val="ko-KR"/>
-        </w:rPr>
-        <w:t>Edges</w:t>
-      </w:r>
-      <w:proofErr w:type="spellEnd"/>
-    </w:p>
-    <w:p>
-      <w:pPr>
-        <w:pStyle w:val="4"/>
-      </w:pPr>
-      <w:r>
-        <w:t>tolerance</w:t>
-      </w:r>
-    </w:p>
-    <w:p>
-      <w:pPr>
-        <w:pStyle w:val="5"/>
-        <w:rPr>
-          <w:lang w:val="ko-KR"/>
-        </w:rPr>
-      </w:pPr>
-      <w:bookmarkStart w:id="2" w:name="_Hlk149837170"/>
-      <w:proofErr w:type="spellStart"/>
-      <w:r>
-        <w:rPr>
-          <w:rFonts w:hint="eastAsia"/>
-          <w:lang w:val="ko-KR"/>
-        </w:rPr>
-        <w:t>T</w:t>
-      </w:r>
-      <w:r>
-        <w:rPr>
-          <w:lang w:val="ko-KR"/>
-        </w:rPr>
-        <w:t>ype</w:t>
-      </w:r>
-      <w:proofErr w:type="spellEnd"/>
-      <w:r>
-        <w:rPr>
-          <w:lang w:val="ko-KR"/>
-        </w:rPr>
-        <w:t xml:space="preserve">: </w:t>
-      </w:r>
-      <w:proofErr w:type="spellStart"/>
-      <w:r>
-        <w:rPr>
-          <w:lang w:val="ko-KR"/>
-        </w:rPr>
-        <w:t>float</w:t>
-      </w:r>
-      <w:proofErr w:type="spellEnd"/>
-      <w:r>
-        <w:rPr>
-          <w:lang w:val="ko-KR"/>
-        </w:rPr>
-        <w:t xml:space="preserve"> (1 – 100)</w:t>
-      </w:r>
-    </w:p>
-    <w:p>
-      <w:pPr>
-        <w:pStyle w:val="5"/>
-        <w:rPr>
-          <w:lang w:val="ko-KR"/>
-        </w:rPr>
-      </w:pPr>
-      <w:r>
-        <w:rPr>
-          <w:rFonts w:hint="eastAsia"/>
-        </w:rPr>
-        <w:t xml:space="preserve">default </w:t>
-      </w:r>
-      <w:r>
-        <w:t>value</w:t>
-      </w:r>
-      <w:r>
-        <w:rPr>
-          <w:lang w:val="ko-KR"/>
-        </w:rPr>
-        <w:t>:</w:t>
-      </w:r>
-      <w:r>
-        <w:rPr>
-          <w:lang w:val="ko-KR"/>
-        </w:rPr>
-        <w:t xml:space="preserve"> 1.0f</w:t>
-      </w:r>
-      <w:bookmarkEnd w:id="2"/>
-    </w:p>
-    <w:p>
-      <w:pPr>
-        <w:pStyle w:val="5"/>
-      </w:pPr>
-      <w:r>
-        <w:t xml:space="preserve">UI </w:t>
-      </w:r>
-      <w:r>
-        <w:rPr>
-          <w:rFonts w:hint="eastAsia"/>
-        </w:rPr>
-        <w:t>설정</w:t>
-      </w:r>
-    </w:p>
-    <w:p>
-      <w:pPr>
-        <w:pStyle w:val="5"/>
-        <w:numPr>
-          <w:ilvl w:val="4"/>
-          <w:numId w:val="39"/>
-        </w:numPr>
-      </w:pPr>
-      <w:r>
-        <w:rPr>
-          <w:rFonts w:hint="eastAsia"/>
-        </w:rPr>
-        <w:t>T</w:t>
-      </w:r>
-      <w:r>
-        <w:t>ype: slide</w:t>
-      </w:r>
-    </w:p>
-    <w:p>
-      <w:pPr>
-        <w:pStyle w:val="5"/>
-        <w:numPr>
-          <w:ilvl w:val="4"/>
-          <w:numId w:val="39"/>
-        </w:numPr>
-      </w:pPr>
-      <w:r>
-        <w:rPr>
-          <w:rFonts w:hint="eastAsia"/>
-        </w:rPr>
-        <w:t>d</w:t>
-      </w:r>
-      <w:r>
-        <w:t>efault value: 1</w:t>
-      </w:r>
-    </w:p>
-    <w:p>
-      <w:pPr>
-        <w:pStyle w:val="6"/>
-        <w:rPr>
-          <w:lang w:val="ko-KR"/>
-        </w:rPr>
-      </w:pPr>
-      <w:r>
-        <w:rPr>
-          <w:rFonts w:hint="eastAsia"/>
-        </w:rPr>
-        <w:t>R</w:t>
-      </w:r>
-      <w:r>
-        <w:t>ange: 1 ~ 20</w:t>
-      </w:r>
-    </w:p>
-    <w:p>
-      <w:pPr>
-        <w:pStyle w:val="4"/>
-        <w:rPr>
-          <w:lang w:val="ko-KR"/>
-        </w:rPr>
-      </w:pPr>
-      <w:proofErr w:type="spellStart"/>
-      <w:r>
-        <w:rPr>
-          <w:lang w:val="ko-KR"/>
-        </w:rPr>
-        <w:t>HeavyExterior</w:t>
-      </w:r>
-      <w:proofErr w:type="spellEnd"/>
-    </w:p>
-    <w:p>
-      <w:pPr>
-        <w:pStyle w:val="5"/>
-        <w:rPr>
-          <w:lang w:val="ko-KR"/>
-        </w:rPr>
-      </w:pPr>
-      <w:proofErr w:type="spellStart"/>
-      <w:r>
-        <w:rPr>
-          <w:rFonts w:hint="eastAsia"/>
-          <w:lang w:val="ko-KR"/>
-        </w:rPr>
-        <w:t>T</w:t>
-      </w:r>
-      <w:r>
-        <w:rPr>
-          <w:lang w:val="ko-KR"/>
-        </w:rPr>
-        <w:t>ype</w:t>
-      </w:r>
-      <w:proofErr w:type="spellEnd"/>
-      <w:r>
-        <w:rPr>
-          <w:lang w:val="ko-KR"/>
-        </w:rPr>
-        <w:t>: bool</w:t>
-      </w:r>
-    </w:p>
-    <w:p>
-      <w:pPr>
-        <w:pStyle w:val="5"/>
-        <w:rPr>
-          <w:lang w:val="ko-KR"/>
-        </w:rPr>
-      </w:pPr>
-      <w:r>
-        <w:rPr>
-          <w:rFonts w:hint="eastAsia"/>
-        </w:rPr>
-        <w:t xml:space="preserve">default </w:t>
-      </w:r>
-      <w:r>
-        <w:t>value</w:t>
-      </w:r>
-      <w:r>
-        <w:rPr>
-          <w:lang w:val="ko-KR"/>
-        </w:rPr>
-        <w:t>:</w:t>
-      </w:r>
-      <w:r>
-        <w:rPr>
-          <w:lang w:val="ko-KR"/>
-        </w:rPr>
-        <w:t xml:space="preserve"> </w:t>
-      </w:r>
-      <w:proofErr w:type="spellStart"/>
-      <w:r>
-        <w:rPr>
-          <w:lang w:val="ko-KR"/>
-        </w:rPr>
-        <w:t>true</w:t>
-      </w:r>
-      <w:proofErr w:type="spellEnd"/>
-    </w:p>
-    <w:p>
-      <w:pPr>
-        <w:pStyle w:val="3"/>
-        <w:rPr>
-          <w:lang w:val="ko-KR"/>
-        </w:rPr>
-      </w:pPr>
-      <w:proofErr w:type="spellStart"/>
-      <w:r>
-        <w:rPr>
-          <w:lang w:val="ko-KR"/>
-        </w:rPr>
-        <w:t>Bloom</w:t>
-      </w:r>
-      <w:proofErr w:type="spellEnd"/>
-    </w:p>
-    <w:p>
-      <w:pPr>
-        <w:pStyle w:val="4"/>
-        <w:rPr>
-          <w:lang w:val="ko-KR"/>
-        </w:rPr>
-      </w:pPr>
-      <w:proofErr w:type="spellStart"/>
-      <w:r>
-        <w:rPr>
-          <w:lang w:val="ko-KR"/>
-        </w:rPr>
-        <w:t>strength</w:t>
-      </w:r>
-      <w:proofErr w:type="spellEnd"/>
-    </w:p>
-    <w:p>
-      <w:pPr>
-        <w:pStyle w:val="5"/>
-        <w:rPr>
-          <w:lang w:val="ko-KR"/>
-        </w:rPr>
-      </w:pPr>
-      <w:proofErr w:type="spellStart"/>
-      <w:r>
-        <w:rPr>
-          <w:lang w:val="ko-KR"/>
-        </w:rPr>
-        <w:t>Type</w:t>
-      </w:r>
-      <w:proofErr w:type="spellEnd"/>
-      <w:r>
-        <w:rPr>
-          <w:lang w:val="ko-KR"/>
-        </w:rPr>
-        <w:t xml:space="preserve">: </w:t>
-      </w:r>
-      <w:proofErr w:type="spellStart"/>
-      <w:r>
-        <w:rPr>
-          <w:lang w:val="ko-KR"/>
-        </w:rPr>
-        <w:t>float</w:t>
-      </w:r>
-      <w:proofErr w:type="spellEnd"/>
-      <w:r>
-        <w:rPr>
-          <w:lang w:val="ko-KR"/>
-        </w:rPr>
-        <w:t xml:space="preserve"> (1 - 10)</w:t>
-      </w:r>
-    </w:p>
-    <w:p>
-      <w:pPr>
-        <w:pStyle w:val="5"/>
-        <w:rPr>
-          <w:lang w:val="ko-KR"/>
-        </w:rPr>
-      </w:pPr>
-      <w:r>
-        <w:rPr>
-          <w:rFonts w:hint="eastAsia"/>
-        </w:rPr>
-        <w:t xml:space="preserve">default </w:t>
-      </w:r>
-      <w:r>
-        <w:t>value</w:t>
-      </w:r>
-      <w:r>
-        <w:rPr>
-          <w:lang w:val="ko-KR"/>
-        </w:rPr>
-        <w:t>:</w:t>
-      </w:r>
-      <w:r>
-        <w:rPr>
-          <w:lang w:val="ko-KR"/>
-        </w:rPr>
-        <w:t xml:space="preserve"> </w:t>
-      </w:r>
-      <w:r>
-        <w:rPr>
-          <w:lang w:val="ko-KR"/>
-        </w:rPr>
-        <w:t>1</w:t>
-      </w:r>
-      <w:r>
-        <w:rPr>
-          <w:lang w:val="ko-KR"/>
-        </w:rPr>
-        <w:t>.0f</w:t>
-      </w:r>
-    </w:p>
-    <w:p>
-      <w:pPr>
-        <w:pStyle w:val="5"/>
-      </w:pPr>
-      <w:r>
-        <w:t xml:space="preserve">UI </w:t>
-      </w:r>
-      <w:r>
-        <w:rPr>
-          <w:rFonts w:hint="eastAsia"/>
-        </w:rPr>
-        <w:t>설정</w:t>
-      </w:r>
-    </w:p>
-    <w:p>
-      <w:pPr>
-        <w:pStyle w:val="5"/>
-        <w:numPr>
-          <w:ilvl w:val="4"/>
-          <w:numId w:val="39"/>
-        </w:numPr>
-      </w:pPr>
-      <w:r>
-        <w:rPr>
-          <w:rFonts w:hint="eastAsia"/>
-        </w:rPr>
-        <w:t>T</w:t>
-      </w:r>
-      <w:r>
-        <w:t>ype: slide</w:t>
-      </w:r>
-    </w:p>
-    <w:p>
-      <w:pPr>
-        <w:pStyle w:val="5"/>
-        <w:numPr>
-          <w:ilvl w:val="4"/>
-          <w:numId w:val="39"/>
-        </w:numPr>
-      </w:pPr>
-      <w:r>
-        <w:rPr>
-          <w:rFonts w:hint="eastAsia"/>
-        </w:rPr>
-        <w:t>d</w:t>
-      </w:r>
-      <w:r>
-        <w:t>efault value: 1</w:t>
-      </w:r>
-    </w:p>
-    <w:p>
-      <w:pPr>
-        <w:pStyle w:val="6"/>
-        <w:rPr>
-          <w:lang w:val="ko-KR"/>
-        </w:rPr>
-      </w:pPr>
-      <w:r>
-        <w:rPr>
-          <w:rFonts w:hint="eastAsia"/>
-        </w:rPr>
-        <w:t>R</w:t>
-      </w:r>
-      <w:r>
-        <w:t xml:space="preserve">ange: 1 ~ </w:t>
-      </w:r>
-      <w:r>
-        <w:t>1</w:t>
-      </w:r>
-      <w:r>
-        <w:t>0</w:t>
-      </w:r>
-    </w:p>
-    <w:p>
-      <w:pPr>
-        <w:pStyle w:val="4"/>
-      </w:pPr>
-      <w:r>
-        <w:t>blur</w:t>
-      </w:r>
-    </w:p>
-    <w:p>
-      <w:pPr>
-        <w:pStyle w:val="5"/>
-        <w:rPr>
-          <w:lang w:val="ko-KR"/>
-        </w:rPr>
-      </w:pPr>
-      <w:proofErr w:type="spellStart"/>
-      <w:r>
-        <w:rPr>
-          <w:rFonts w:hint="eastAsia"/>
-          <w:lang w:val="ko-KR"/>
-        </w:rPr>
-        <w:t>T</w:t>
-      </w:r>
-      <w:r>
-        <w:rPr>
-          <w:lang w:val="ko-KR"/>
-        </w:rPr>
-        <w:t>ype</w:t>
-      </w:r>
-      <w:proofErr w:type="spellEnd"/>
-      <w:r>
-        <w:rPr>
-          <w:lang w:val="ko-KR"/>
-        </w:rPr>
-        <w:t xml:space="preserve">: </w:t>
-      </w:r>
-      <w:proofErr w:type="spellStart"/>
-      <w:r>
-        <w:rPr>
           <w:lang w:val="ko-KR"/>
         </w:rPr>
         <w:t>int</w:t>
       </w:r>
-      <w:proofErr w:type="spellEnd"/>
       <w:r>
         <w:rPr>
           <w:lang w:val="ko-KR"/>
@@ -2561,29 +2177,171 @@
     </w:p>
     <w:p>
       <w:pPr>
+        <w:pStyle w:val="6"/>
+      </w:pPr>
+      <w:r>
+        <w:rPr>
+          <w:rFonts w:hint="eastAsia"/>
+        </w:rPr>
+        <w:t>T</w:t>
+      </w:r>
+      <w:r>
+        <w:t>ype: slide</w:t>
+      </w:r>
+    </w:p>
+    <w:p>
+      <w:pPr>
+        <w:pStyle w:val="6"/>
+      </w:pPr>
+      <w:r>
+        <w:rPr>
+          <w:rFonts w:hint="eastAsia"/>
+        </w:rPr>
+        <w:t>d</w:t>
+      </w:r>
+      <w:r>
+        <w:t>efault value: 1</w:t>
+      </w:r>
+    </w:p>
+    <w:p>
+      <w:pPr>
+        <w:pStyle w:val="6"/>
+        <w:rPr>
+          <w:lang w:val="ko-KR"/>
+        </w:rPr>
+      </w:pPr>
+      <w:r>
+        <w:rPr>
+          <w:rFonts w:hint="eastAsia"/>
+        </w:rPr>
+        <w:t>R</w:t>
+      </w:r>
+      <w:r>
+        <w:t>ange: 1 ~ 10</w:t>
+      </w:r>
+    </w:p>
+    <w:p>
+      <w:pPr>
+        <w:pStyle w:val="4"/>
+        <w:rPr>
+          <w:lang w:val="ko-KR"/>
+        </w:rPr>
+      </w:pPr>
+      <w:r>
+        <w:rPr>
+          <w:lang w:val="ko-KR"/>
+        </w:rPr>
+        <w:t>s</w:t>
+      </w:r>
+      <w:r>
+        <w:rPr>
+          <w:lang w:val="ko-KR"/>
+        </w:rPr>
+        <w:t>hape</w:t>
+      </w:r>
+    </w:p>
+    <w:p>
+      <w:pPr>
         <w:pStyle w:val="5"/>
-        <w:numPr>
-          <w:ilvl w:val="4"/>
-          <w:numId w:val="39"/>
-        </w:numPr>
-      </w:pPr>
-      <w:r>
-        <w:rPr>
-          <w:rFonts w:hint="eastAsia"/>
+        <w:rPr>
+          <w:lang w:val="ko-KR"/>
+        </w:rPr>
+      </w:pPr>
+      <w:r>
+        <w:rPr>
+          <w:rFonts w:hint="eastAsia"/>
+          <w:lang w:val="ko-KR"/>
         </w:rPr>
         <w:t>T</w:t>
       </w:r>
       <w:r>
-        <w:t>ype: slide</w:t>
+        <w:rPr>
+          <w:lang w:val="ko-KR"/>
+        </w:rPr>
+        <w:t xml:space="preserve">ype: enum </w:t>
+      </w:r>
+      <w:r>
+        <w:rPr>
+          <w:lang w:val="ko-KR"/>
+        </w:rPr>
+        <w:t>HBloomShape</w:t>
       </w:r>
     </w:p>
     <w:p>
       <w:pPr>
         <w:pStyle w:val="5"/>
-        <w:numPr>
-          <w:ilvl w:val="4"/>
-          <w:numId w:val="39"/>
-        </w:numPr>
+        <w:rPr>
+          <w:lang w:val="ko-KR"/>
+        </w:rPr>
+      </w:pPr>
+      <w:r>
+        <w:rPr>
+          <w:rFonts w:hint="eastAsia"/>
+        </w:rPr>
+        <w:t xml:space="preserve">default </w:t>
+      </w:r>
+      <w:r>
+        <w:t>value</w:t>
+      </w:r>
+      <w:r>
+        <w:rPr>
+          <w:lang w:val="ko-KR"/>
+        </w:rPr>
+        <w:t>:</w:t>
+      </w:r>
+      <w:r>
+        <w:rPr>
+          <w:lang w:val="ko-KR"/>
+        </w:rPr>
+        <w:t xml:space="preserve"> </w:t>
+      </w:r>
+      <w:r>
+        <w:rPr>
+          <w:lang w:val="ko-KR"/>
+        </w:rPr>
+        <w:t>RadialBloom</w:t>
+      </w:r>
+    </w:p>
+    <w:p>
+      <w:pPr>
+        <w:pStyle w:val="5"/>
+      </w:pPr>
+      <w:r>
+        <w:t xml:space="preserve">UI </w:t>
+      </w:r>
+      <w:r>
+        <w:rPr>
+          <w:rFonts w:hint="eastAsia"/>
+        </w:rPr>
+        <w:t>설정</w:t>
+      </w:r>
+    </w:p>
+    <w:p>
+      <w:pPr>
+        <w:pStyle w:val="6"/>
+      </w:pPr>
+      <w:r>
+        <w:rPr>
+          <w:rFonts w:hint="eastAsia"/>
+        </w:rPr>
+        <w:t>T</w:t>
+      </w:r>
+      <w:r>
+        <w:t xml:space="preserve">ype: </w:t>
+      </w:r>
+      <w:r>
+        <w:rPr>
+          <w:rFonts w:hint="eastAsia"/>
+        </w:rPr>
+        <w:t>c</w:t>
+      </w:r>
+      <w:r>
+        <w:t>ombo box</w:t>
+      </w:r>
+    </w:p>
+    <w:p>
+      <w:pPr>
+        <w:pStyle w:val="6"/>
       </w:pPr>
       <w:r>
         <w:rPr>
@@ -2592,7 +2350,7 @@
         <w:t>d</w:t>
       </w:r>
       <w:r>
-        <w:t>efault value: 1</w:t>
+        <w:t>efault value: Radial</w:t>
       </w:r>
     </w:p>
     <w:p>
@@ -2603,131 +2361,42 @@
         </w:rPr>
       </w:pPr>
       <w:r>
-        <w:rPr>
-          <w:rFonts w:hint="eastAsia"/>
-        </w:rPr>
-        <w:t>R</w:t>
-      </w:r>
-      <w:r>
-        <w:t>ange: 1 ~ 10</w:t>
-      </w:r>
-    </w:p>
-    <w:p>
-      <w:pPr>
-        <w:pStyle w:val="4"/>
-        <w:rPr>
-          <w:lang w:val="ko-KR"/>
-        </w:rPr>
-      </w:pPr>
-      <w:proofErr w:type="spellStart"/>
-      <w:r>
-        <w:rPr>
-          <w:lang w:val="ko-KR"/>
-        </w:rPr>
-        <w:t>s</w:t>
-      </w:r>
-      <w:r>
-        <w:rPr>
-          <w:lang w:val="ko-KR"/>
-        </w:rPr>
-        <w:t>hape</w:t>
-      </w:r>
-      <w:proofErr w:type="spellEnd"/>
-    </w:p>
-    <w:p>
-      <w:pPr>
-        <w:pStyle w:val="5"/>
-        <w:rPr>
-          <w:lang w:val="ko-KR"/>
-        </w:rPr>
-      </w:pPr>
-      <w:proofErr w:type="spellStart"/>
-      <w:r>
-        <w:rPr>
-          <w:rFonts w:hint="eastAsia"/>
-          <w:lang w:val="ko-KR"/>
-        </w:rPr>
-        <w:t>T</w:t>
-      </w:r>
-      <w:r>
-        <w:rPr>
-          <w:lang w:val="ko-KR"/>
-        </w:rPr>
-        <w:t>ype</w:t>
-      </w:r>
-      <w:proofErr w:type="spellEnd"/>
-      <w:r>
-        <w:rPr>
-          <w:lang w:val="ko-KR"/>
-        </w:rPr>
-        <w:t xml:space="preserve">: </w:t>
-      </w:r>
-      <w:proofErr w:type="spellStart"/>
-      <w:r>
-        <w:rPr>
-          <w:lang w:val="ko-KR"/>
-        </w:rPr>
-        <w:t>enum</w:t>
-      </w:r>
-      <w:proofErr w:type="spellEnd"/>
-      <w:r>
-        <w:rPr>
-          <w:lang w:val="ko-KR"/>
-        </w:rPr>
+        <w:t xml:space="preserve">Value: </w:t>
+      </w:r>
+      <w:r>
+        <w:t>Radial</w:t>
+      </w:r>
+      <w:r>
+        <w:t xml:space="preserve">, </w:t>
+      </w:r>
+      <w:r>
+        <w:t>Star</w:t>
+      </w:r>
+    </w:p>
+    <w:p>
+      <w:pPr>
+        <w:pStyle w:val="1"/>
+      </w:pPr>
+      <w:r>
+        <w:t>Highlight</w:t>
+      </w:r>
+      <w:r>
         <w:t xml:space="preserve"> </w:t>
       </w:r>
-      <w:proofErr w:type="spellStart"/>
-      <w:r>
-        <w:rPr>
-          <w:lang w:val="ko-KR"/>
-        </w:rPr>
-        <w:t>HBloomShape</w:t>
-      </w:r>
-      <w:proofErr w:type="spellEnd"/>
-    </w:p>
-    <w:p>
-      <w:pPr>
-        <w:pStyle w:val="5"/>
-        <w:rPr>
-          <w:lang w:val="ko-KR"/>
-        </w:rPr>
-      </w:pPr>
-      <w:r>
-        <w:rPr>
-          <w:rFonts w:hint="eastAsia"/>
-        </w:rPr>
-        <w:t xml:space="preserve">default </w:t>
-      </w:r>
-      <w:r>
-        <w:t>value</w:t>
-      </w:r>
-      <w:r>
-        <w:rPr>
-          <w:lang w:val="ko-KR"/>
-        </w:rPr>
-        <w:t>:</w:t>
-      </w:r>
-      <w:r>
-        <w:rPr>
-          <w:lang w:val="ko-KR"/>
-        </w:rPr>
+      <w:r>
+        <w:t>Selection</w:t>
+      </w:r>
+      <w:r>
         <w:t xml:space="preserve"> </w:t>
       </w:r>
-      <w:proofErr w:type="spellStart"/>
-      <w:r>
-        <w:rPr>
-          <w:lang w:val="ko-KR"/>
-        </w:rPr>
-        <w:t>RadialBloom</w:t>
-      </w:r>
-      <w:proofErr w:type="spellEnd"/>
-    </w:p>
-    <w:p>
-      <w:pPr>
-        <w:pStyle w:val="5"/>
-      </w:pPr>
-      <w:r>
-        <w:t xml:space="preserve">UI </w:t>
+      <w:r>
+        <w:rPr>
+          <w:rFonts w:hint="eastAsia"/>
+        </w:rPr>
+        <w:t>S</w:t>
+      </w:r>
+      <w:r>
+        <w:t xml:space="preserve">tyle </w:t>
       </w:r>
       <w:r>
         <w:rPr>
@@ -2738,117 +2407,7 @@
     </w:p>
     <w:p>
       <w:pPr>
-        <w:pStyle w:val="5"/>
-        <w:numPr>
-          <w:ilvl w:val="4"/>
-          <w:numId w:val="39"/>
-        </w:numPr>
-      </w:pPr>
-      <w:r>
-        <w:rPr>
-          <w:rFonts w:hint="eastAsia"/>
-        </w:rPr>
-        <w:t>T</w:t>
-      </w:r>
-      <w:r>
-        <w:t xml:space="preserve">ype: </w:t>
-      </w:r>
-      <w:r>
-        <w:rPr>
-          <w:rFonts w:hint="eastAsia"/>
-        </w:rPr>
-        <w:t>c</w:t>
-      </w:r>
-      <w:r>
-        <w:t>ombo box</w:t>
-      </w:r>
-    </w:p>
-    <w:p>
-      <w:pPr>
-        <w:pStyle w:val="5"/>
-        <w:numPr>
-          <w:ilvl w:val="4"/>
-          <w:numId w:val="39"/>
-        </w:numPr>
-      </w:pPr>
-      <w:r>
-        <w:rPr>
-          <w:rFonts w:hint="eastAsia"/>
-        </w:rPr>
-        <w:t>d</w:t>
-      </w:r>
-      <w:r>
-        <w:t xml:space="preserve">efault value: </w:t>
-      </w:r>
-      <w:r>
-        <w:t>Radial</w:t>
-      </w:r>
-    </w:p>
-    <w:p>
-      <w:pPr>
-        <w:pStyle w:val="6"/>
-        <w:rPr>
-          <w:lang w:val="ko-KR"/>
-        </w:rPr>
-      </w:pPr>
-      <w:r>
-        <w:t xml:space="preserve">Value: </w:t>
-      </w:r>
-      <w:r>
-        <w:t>Radial</w:t>
-      </w:r>
-      <w:r>
-        <w:t xml:space="preserve">, </w:t>
-      </w:r>
-      <w:r>
-        <w:t>Star</w:t>
-      </w:r>
-    </w:p>
-    <w:p>
-      <w:pPr>
-        <w:pStyle w:val="1"/>
-      </w:pPr>
-      <w:proofErr w:type="spellStart"/>
-      <w:r>
-        <w:t>Highlight</w:t>
-      </w:r>
-      <w:proofErr w:type="spellEnd"/>
-      <w:r>
-        <w:t xml:space="preserve"> </w:t>
-      </w:r>
-      <w:proofErr w:type="spellStart"/>
-      <w:r>
-        <w:t>Selection</w:t>
-      </w:r>
-      <w:proofErr w:type="spellEnd"/>
-      <w:r>
-        <w:t xml:space="preserve"> </w:t>
-      </w:r>
-      <w:proofErr w:type="spellStart"/>
-      <w:r>
-        <w:rPr>
-          <w:rFonts w:hint="eastAsia"/>
-        </w:rPr>
-        <w:t>S</w:t>
-      </w:r>
-      <w:r>
-        <w:t>tyle</w:t>
-      </w:r>
-      <w:proofErr w:type="spellEnd"/>
-      <w:r>
-        <w:t xml:space="preserve"> </w:t>
-      </w:r>
-      <w:r>
-        <w:rPr>
-          <w:rFonts w:hint="eastAsia"/>
-        </w:rPr>
-        <w:t>설정</w:t>
-      </w:r>
-    </w:p>
-    <w:p>
-      <w:pPr>
-        <w:rPr>
-          <w:rFonts w:hint="eastAsia"/>
+        <w:rPr>
           <w:lang w:val="ko-KR"/>
         </w:rPr>
       </w:pPr>
@@ -2932,7 +2491,7 @@
   <w:abstractNum w:abstractNumId="0" w15:restartNumberingAfterBreak="0">
     <w:nsid w:val="4214429C"/>
     <w:multiLevelType w:val="multilevel"/>
-    <w:tmpl w:val="84BEFF40"/>
+    <w:tmpl w:val="68DAD164"/>
     <w:lvl w:ilvl="0">
       <w:start w:val="1"/>
       <w:numFmt w:val="decimal"/>
@@ -4112,6 +3671,39 @@
     <w:abstractNumId w:val="0"/>
   </w:num>
   <w:num w:numId="40" w16cid:durableId="1882668422">
+    <w:abstractNumId w:val="0"/>
+  </w:num>
+  <w:num w:numId="41" w16cid:durableId="293607760">
+    <w:abstractNumId w:val="0"/>
+    <w:lvlOverride w:ilvl="0">
+      <w:startOverride w:val="1"/>
+    </w:lvlOverride>
+    <w:lvlOverride w:ilvl="1">
+      <w:startOverride w:val="1"/>
+    </w:lvlOverride>
+    <w:lvlOverride w:ilvl="2">
+      <w:startOverride w:val="1"/>
+    </w:lvlOverride>
+    <w:lvlOverride w:ilvl="3">
+      <w:startOverride w:val="1"/>
+    </w:lvlOverride>
+    <w:lvlOverride w:ilvl="4">
+      <w:startOverride w:val="1"/>
+    </w:lvlOverride>
+    <w:lvlOverride w:ilvl="5">
+      <w:startOverride w:val="1"/>
+    </w:lvlOverride>
+    <w:lvlOverride w:ilvl="6">
+      <w:startOverride w:val="1"/>
+    </w:lvlOverride>
+    <w:lvlOverride w:ilvl="7">
+      <w:startOverride w:val="1"/>
+    </w:lvlOverride>
+    <w:lvlOverride w:ilvl="8">
+      <w:startOverride w:val="1"/>
+    </w:lvlOverride>
+  </w:num>
+  <w:num w:numId="42" w16cid:durableId="590506045">
     <w:abstractNumId w:val="0"/>
     <w:lvlOverride w:ilvl="0">
       <w:startOverride w:val="1"/>
@@ -4584,7 +4176,7 @@
     <w:uiPriority w:val="9"/>
     <w:unhideWhenUsed/>
     <w:qFormat/>
-    <w:rsid w:val="007D6F79"/>
+    <w:rsid w:val="005C392F"/>
     <w:pPr>
       <w:numPr>
         <w:numId w:val="1"/>
@@ -4616,7 +4208,7 @@
     <w:pPr>
       <w:numPr>
         <w:ilvl w:val="1"/>
-        <w:numId w:val="39"/>
+        <w:numId w:val="40"/>
       </w:numPr>
       <w:spacing w:line="240" w:lineRule="auto"/>
       <w:ind w:leftChars="0"/>
@@ -4634,7 +4226,7 @@
     <w:pPr>
       <w:numPr>
         <w:ilvl w:val="2"/>
-        <w:numId w:val="39"/>
+        <w:numId w:val="40"/>
       </w:numPr>
       <w:spacing w:line="240" w:lineRule="auto"/>
       <w:ind w:leftChars="0"/>
@@ -4655,7 +4247,7 @@
     <w:pPr>
       <w:numPr>
         <w:ilvl w:val="3"/>
-        <w:numId w:val="39"/>
+        <w:numId w:val="40"/>
       </w:numPr>
       <w:spacing w:line="240" w:lineRule="auto"/>
       <w:ind w:leftChars="0"/>
@@ -4804,7 +4396,7 @@
     <w:basedOn w:val="a1"/>
     <w:link w:val="2"/>
     <w:uiPriority w:val="9"/>
-    <w:rsid w:val="007D6F79"/>
+    <w:rsid w:val="005C392F"/>
     <w:rPr>
       <w:b/>
       <w:spacing w:val="15"/>

</xml_diff>

<commit_message>
[feat] KERNEL::Command::Select::SelectByResult 관련 함수 및 기능들 처리
</commit_message>
<xml_diff>
--- a/V1/Documents/3DMI Develop Spec.docx
+++ b/V1/Documents/3DMI Develop Spec.docx
@@ -1,6 +1,6 @@
 
 <file path=word/document.xml><?xml version="1.0" encoding="utf-8"?>
-<w:document xmlns:wpc="http://schemas.microsoft.com/office/word/2010/wordprocessingCanvas" xmlns:cx="http://schemas.microsoft.com/office/drawing/2014/chartex" xmlns:cx1="http://schemas.microsoft.com/office/drawing/2015/9/8/chartex" xmlns:cx2="http://schemas.microsoft.com/office/drawing/2015/10/21/chartex" xmlns:cx3="http://schemas.microsoft.com/office/drawing/2016/5/9/chartex" xmlns:cx4="http://schemas.microsoft.com/office/drawing/2016/5/10/chartex" xmlns:cx5="http://schemas.microsoft.com/office/drawing/2016/5/11/chartex" xmlns:cx6="http://schemas.microsoft.com/office/drawing/2016/5/12/chartex" xmlns:cx7="http://schemas.microsoft.com/office/drawing/2016/5/13/chartex" xmlns:cx8="http://schemas.microsoft.com/office/drawing/2016/5/14/chartex" xmlns:mc="http://schemas.openxmlformats.org/markup-compatibility/2006" xmlns:aink="http://schemas.microsoft.com/office/drawing/2016/ink" xmlns:am3d="http://schemas.microsoft.com/office/drawing/2017/model3d" xmlns:o="urn:schemas-microsoft-com:office:office" xmlns:oel="http://schemas.microsoft.com/office/2019/extlst" xmlns:r="http://schemas.openxmlformats.org/officeDocument/2006/relationships" xmlns:m="http://schemas.openxmlformats.org/officeDocument/2006/math" xmlns:v="urn:schemas-microsoft-com:vml" xmlns:wp14="http://schemas.microsoft.com/office/word/2010/wordprocessingDrawing" xmlns:wp="http://schemas.openxmlformats.org/drawingml/2006/wordprocessingDrawing" xmlns:w10="urn:schemas-microsoft-com:office:word" xmlns:w="http://schemas.openxmlformats.org/wordprocessingml/2006/main" xmlns:w14="http://schemas.microsoft.com/office/word/2010/wordml" xmlns:w15="http://schemas.microsoft.com/office/word/2012/wordml" xmlns:w16cex="http://schemas.microsoft.com/office/word/2018/wordml/cex" xmlns:w16cid="http://schemas.microsoft.com/office/word/2016/wordml/cid" xmlns:w16="http://schemas.microsoft.com/office/word/2018/wordml" xmlns:w16du="http://schemas.microsoft.com/office/word/2023/wordml/word16du" xmlns:w16sdtdh="http://schemas.microsoft.com/office/word/2020/wordml/sdtdatahash" xmlns:w16se="http://schemas.microsoft.com/office/word/2015/wordml/symex" xmlns:wpg="http://schemas.microsoft.com/office/word/2010/wordprocessingGroup" xmlns:wpi="http://schemas.microsoft.com/office/word/2010/wordprocessingInk" xmlns:wne="http://schemas.microsoft.com/office/word/2006/wordml" xmlns:wps="http://schemas.microsoft.com/office/word/2010/wordprocessingShape" mc:Ignorable="w14 w15 w16se w16cid w16 w16cex w16sdtdh w16du wp14">
+<w:document xmlns:wpc="http://schemas.microsoft.com/office/word/2010/wordprocessingCanvas" xmlns:cx="http://schemas.microsoft.com/office/drawing/2014/chartex" xmlns:cx1="http://schemas.microsoft.com/office/drawing/2015/9/8/chartex" xmlns:cx2="http://schemas.microsoft.com/office/drawing/2015/10/21/chartex" xmlns:cx3="http://schemas.microsoft.com/office/drawing/2016/5/9/chartex" xmlns:cx4="http://schemas.microsoft.com/office/drawing/2016/5/10/chartex" xmlns:cx5="http://schemas.microsoft.com/office/drawing/2016/5/11/chartex" xmlns:cx6="http://schemas.microsoft.com/office/drawing/2016/5/12/chartex" xmlns:cx7="http://schemas.microsoft.com/office/drawing/2016/5/13/chartex" xmlns:cx8="http://schemas.microsoft.com/office/drawing/2016/5/14/chartex" xmlns:mc="http://schemas.openxmlformats.org/markup-compatibility/2006" xmlns:aink="http://schemas.microsoft.com/office/drawing/2016/ink" xmlns:am3d="http://schemas.microsoft.com/office/drawing/2017/model3d" xmlns:o="urn:schemas-microsoft-com:office:office" xmlns:oel="http://schemas.microsoft.com/office/2019/extlst" xmlns:r="http://schemas.openxmlformats.org/officeDocument/2006/relationships" xmlns:m="http://schemas.openxmlformats.org/officeDocument/2006/math" xmlns:v="urn:schemas-microsoft-com:vml" xmlns:wp14="http://schemas.microsoft.com/office/word/2010/wordprocessingDrawing" xmlns:wp="http://schemas.openxmlformats.org/drawingml/2006/wordprocessingDrawing" xmlns:w10="urn:schemas-microsoft-com:office:word" xmlns:w="http://schemas.openxmlformats.org/wordprocessingml/2006/main" xmlns:w14="http://schemas.microsoft.com/office/word/2010/wordml" xmlns:w15="http://schemas.microsoft.com/office/word/2012/wordml" xmlns:w16cex="http://schemas.microsoft.com/office/word/2018/wordml/cex" xmlns:w16cid="http://schemas.microsoft.com/office/word/2016/wordml/cid" xmlns:w16="http://schemas.microsoft.com/office/word/2018/wordml" xmlns:w16du="http://schemas.microsoft.com/office/word/2023/wordml/word16du" xmlns:w16sdtdh="http://schemas.microsoft.com/office/word/2020/wordml/sdtdatahash" xmlns:w16sdtfl="http://schemas.microsoft.com/office/word/2024/wordml/sdtformatlock" xmlns:w16se="http://schemas.microsoft.com/office/word/2015/wordml/symex" xmlns:wpg="http://schemas.microsoft.com/office/word/2010/wordprocessingGroup" xmlns:wpi="http://schemas.microsoft.com/office/word/2010/wordprocessingInk" xmlns:wne="http://schemas.microsoft.com/office/word/2006/wordml" xmlns:wps="http://schemas.microsoft.com/office/word/2010/wordprocessingShape" mc:Ignorable="w14 w15 w16se w16cid w16 w16cex w16sdtdh w16sdtfl w16du wp14">
   <w:body>
     <w:p>
       <w:pPr>
@@ -2562,7 +2562,7 @@
 </file>
 
 <file path=word/endnotes.xml><?xml version="1.0" encoding="utf-8"?>
-<w:endnotes xmlns:wpc="http://schemas.microsoft.com/office/word/2010/wordprocessingCanvas" xmlns:cx="http://schemas.microsoft.com/office/drawing/2014/chartex" xmlns:cx1="http://schemas.microsoft.com/office/drawing/2015/9/8/chartex" xmlns:cx2="http://schemas.microsoft.com/office/drawing/2015/10/21/chartex" xmlns:cx3="http://schemas.microsoft.com/office/drawing/2016/5/9/chartex" xmlns:cx4="http://schemas.microsoft.com/office/drawing/2016/5/10/chartex" xmlns:cx5="http://schemas.microsoft.com/office/drawing/2016/5/11/chartex" xmlns:cx6="http://schemas.microsoft.com/office/drawing/2016/5/12/chartex" xmlns:cx7="http://schemas.microsoft.com/office/drawing/2016/5/13/chartex" xmlns:cx8="http://schemas.microsoft.com/office/drawing/2016/5/14/chartex" xmlns:mc="http://schemas.openxmlformats.org/markup-compatibility/2006" xmlns:aink="http://schemas.microsoft.com/office/drawing/2016/ink" xmlns:am3d="http://schemas.microsoft.com/office/drawing/2017/model3d" xmlns:o="urn:schemas-microsoft-com:office:office" xmlns:oel="http://schemas.microsoft.com/office/2019/extlst" xmlns:r="http://schemas.openxmlformats.org/officeDocument/2006/relationships" xmlns:m="http://schemas.openxmlformats.org/officeDocument/2006/math" xmlns:v="urn:schemas-microsoft-com:vml" xmlns:wp14="http://schemas.microsoft.com/office/word/2010/wordprocessingDrawing" xmlns:wp="http://schemas.openxmlformats.org/drawingml/2006/wordprocessingDrawing" xmlns:w10="urn:schemas-microsoft-com:office:word" xmlns:w="http://schemas.openxmlformats.org/wordprocessingml/2006/main" xmlns:w14="http://schemas.microsoft.com/office/word/2010/wordml" xmlns:w15="http://schemas.microsoft.com/office/word/2012/wordml" xmlns:w16cex="http://schemas.microsoft.com/office/word/2018/wordml/cex" xmlns:w16cid="http://schemas.microsoft.com/office/word/2016/wordml/cid" xmlns:w16="http://schemas.microsoft.com/office/word/2018/wordml" xmlns:w16du="http://schemas.microsoft.com/office/word/2023/wordml/word16du" xmlns:w16sdtdh="http://schemas.microsoft.com/office/word/2020/wordml/sdtdatahash" xmlns:w16se="http://schemas.microsoft.com/office/word/2015/wordml/symex" xmlns:wpg="http://schemas.microsoft.com/office/word/2010/wordprocessingGroup" xmlns:wpi="http://schemas.microsoft.com/office/word/2010/wordprocessingInk" xmlns:wne="http://schemas.microsoft.com/office/word/2006/wordml" xmlns:wps="http://schemas.microsoft.com/office/word/2010/wordprocessingShape" mc:Ignorable="w14 w15 w16se w16cid w16 w16cex w16sdtdh w16du wp14">
+<w:endnotes xmlns:wpc="http://schemas.microsoft.com/office/word/2010/wordprocessingCanvas" xmlns:cx="http://schemas.microsoft.com/office/drawing/2014/chartex" xmlns:cx1="http://schemas.microsoft.com/office/drawing/2015/9/8/chartex" xmlns:cx2="http://schemas.microsoft.com/office/drawing/2015/10/21/chartex" xmlns:cx3="http://schemas.microsoft.com/office/drawing/2016/5/9/chartex" xmlns:cx4="http://schemas.microsoft.com/office/drawing/2016/5/10/chartex" xmlns:cx5="http://schemas.microsoft.com/office/drawing/2016/5/11/chartex" xmlns:cx6="http://schemas.microsoft.com/office/drawing/2016/5/12/chartex" xmlns:cx7="http://schemas.microsoft.com/office/drawing/2016/5/13/chartex" xmlns:cx8="http://schemas.microsoft.com/office/drawing/2016/5/14/chartex" xmlns:mc="http://schemas.openxmlformats.org/markup-compatibility/2006" xmlns:aink="http://schemas.microsoft.com/office/drawing/2016/ink" xmlns:am3d="http://schemas.microsoft.com/office/drawing/2017/model3d" xmlns:o="urn:schemas-microsoft-com:office:office" xmlns:oel="http://schemas.microsoft.com/office/2019/extlst" xmlns:r="http://schemas.openxmlformats.org/officeDocument/2006/relationships" xmlns:m="http://schemas.openxmlformats.org/officeDocument/2006/math" xmlns:v="urn:schemas-microsoft-com:vml" xmlns:wp14="http://schemas.microsoft.com/office/word/2010/wordprocessingDrawing" xmlns:wp="http://schemas.openxmlformats.org/drawingml/2006/wordprocessingDrawing" xmlns:w10="urn:schemas-microsoft-com:office:word" xmlns:w="http://schemas.openxmlformats.org/wordprocessingml/2006/main" xmlns:w14="http://schemas.microsoft.com/office/word/2010/wordml" xmlns:w15="http://schemas.microsoft.com/office/word/2012/wordml" xmlns:w16cex="http://schemas.microsoft.com/office/word/2018/wordml/cex" xmlns:w16cid="http://schemas.microsoft.com/office/word/2016/wordml/cid" xmlns:w16="http://schemas.microsoft.com/office/word/2018/wordml" xmlns:w16du="http://schemas.microsoft.com/office/word/2023/wordml/word16du" xmlns:w16sdtdh="http://schemas.microsoft.com/office/word/2020/wordml/sdtdatahash" xmlns:w16sdtfl="http://schemas.microsoft.com/office/word/2024/wordml/sdtformatlock" xmlns:w16se="http://schemas.microsoft.com/office/word/2015/wordml/symex" xmlns:wpg="http://schemas.microsoft.com/office/word/2010/wordprocessingGroup" xmlns:wpi="http://schemas.microsoft.com/office/word/2010/wordprocessingInk" xmlns:wne="http://schemas.microsoft.com/office/word/2006/wordml" xmlns:wps="http://schemas.microsoft.com/office/word/2010/wordprocessingShape" mc:Ignorable="w14 w15 w16se w16cid w16 w16cex w16sdtdh w16sdtfl w16du wp14">
   <w:endnote w:type="separator" w:id="-1">
     <w:p>
       <w:pPr>
@@ -2594,7 +2594,7 @@
 </file>
 
 <file path=word/footnotes.xml><?xml version="1.0" encoding="utf-8"?>
-<w:footnotes xmlns:wpc="http://schemas.microsoft.com/office/word/2010/wordprocessingCanvas" xmlns:cx="http://schemas.microsoft.com/office/drawing/2014/chartex" xmlns:cx1="http://schemas.microsoft.com/office/drawing/2015/9/8/chartex" xmlns:cx2="http://schemas.microsoft.com/office/drawing/2015/10/21/chartex" xmlns:cx3="http://schemas.microsoft.com/office/drawing/2016/5/9/chartex" xmlns:cx4="http://schemas.microsoft.com/office/drawing/2016/5/10/chartex" xmlns:cx5="http://schemas.microsoft.com/office/drawing/2016/5/11/chartex" xmlns:cx6="http://schemas.microsoft.com/office/drawing/2016/5/12/chartex" xmlns:cx7="http://schemas.microsoft.com/office/drawing/2016/5/13/chartex" xmlns:cx8="http://schemas.microsoft.com/office/drawing/2016/5/14/chartex" xmlns:mc="http://schemas.openxmlformats.org/markup-compatibility/2006" xmlns:aink="http://schemas.microsoft.com/office/drawing/2016/ink" xmlns:am3d="http://schemas.microsoft.com/office/drawing/2017/model3d" xmlns:o="urn:schemas-microsoft-com:office:office" xmlns:oel="http://schemas.microsoft.com/office/2019/extlst" xmlns:r="http://schemas.openxmlformats.org/officeDocument/2006/relationships" xmlns:m="http://schemas.openxmlformats.org/officeDocument/2006/math" xmlns:v="urn:schemas-microsoft-com:vml" xmlns:wp14="http://schemas.microsoft.com/office/word/2010/wordprocessingDrawing" xmlns:wp="http://schemas.openxmlformats.org/drawingml/2006/wordprocessingDrawing" xmlns:w10="urn:schemas-microsoft-com:office:word" xmlns:w="http://schemas.openxmlformats.org/wordprocessingml/2006/main" xmlns:w14="http://schemas.microsoft.com/office/word/2010/wordml" xmlns:w15="http://schemas.microsoft.com/office/word/2012/wordml" xmlns:w16cex="http://schemas.microsoft.com/office/word/2018/wordml/cex" xmlns:w16cid="http://schemas.microsoft.com/office/word/2016/wordml/cid" xmlns:w16="http://schemas.microsoft.com/office/word/2018/wordml" xmlns:w16du="http://schemas.microsoft.com/office/word/2023/wordml/word16du" xmlns:w16sdtdh="http://schemas.microsoft.com/office/word/2020/wordml/sdtdatahash" xmlns:w16se="http://schemas.microsoft.com/office/word/2015/wordml/symex" xmlns:wpg="http://schemas.microsoft.com/office/word/2010/wordprocessingGroup" xmlns:wpi="http://schemas.microsoft.com/office/word/2010/wordprocessingInk" xmlns:wne="http://schemas.microsoft.com/office/word/2006/wordml" xmlns:wps="http://schemas.microsoft.com/office/word/2010/wordprocessingShape" mc:Ignorable="w14 w15 w16se w16cid w16 w16cex w16sdtdh w16du wp14">
+<w:footnotes xmlns:wpc="http://schemas.microsoft.com/office/word/2010/wordprocessingCanvas" xmlns:cx="http://schemas.microsoft.com/office/drawing/2014/chartex" xmlns:cx1="http://schemas.microsoft.com/office/drawing/2015/9/8/chartex" xmlns:cx2="http://schemas.microsoft.com/office/drawing/2015/10/21/chartex" xmlns:cx3="http://schemas.microsoft.com/office/drawing/2016/5/9/chartex" xmlns:cx4="http://schemas.microsoft.com/office/drawing/2016/5/10/chartex" xmlns:cx5="http://schemas.microsoft.com/office/drawing/2016/5/11/chartex" xmlns:cx6="http://schemas.microsoft.com/office/drawing/2016/5/12/chartex" xmlns:cx7="http://schemas.microsoft.com/office/drawing/2016/5/13/chartex" xmlns:cx8="http://schemas.microsoft.com/office/drawing/2016/5/14/chartex" xmlns:mc="http://schemas.openxmlformats.org/markup-compatibility/2006" xmlns:aink="http://schemas.microsoft.com/office/drawing/2016/ink" xmlns:am3d="http://schemas.microsoft.com/office/drawing/2017/model3d" xmlns:o="urn:schemas-microsoft-com:office:office" xmlns:oel="http://schemas.microsoft.com/office/2019/extlst" xmlns:r="http://schemas.openxmlformats.org/officeDocument/2006/relationships" xmlns:m="http://schemas.openxmlformats.org/officeDocument/2006/math" xmlns:v="urn:schemas-microsoft-com:vml" xmlns:wp14="http://schemas.microsoft.com/office/word/2010/wordprocessingDrawing" xmlns:wp="http://schemas.openxmlformats.org/drawingml/2006/wordprocessingDrawing" xmlns:w10="urn:schemas-microsoft-com:office:word" xmlns:w="http://schemas.openxmlformats.org/wordprocessingml/2006/main" xmlns:w14="http://schemas.microsoft.com/office/word/2010/wordml" xmlns:w15="http://schemas.microsoft.com/office/word/2012/wordml" xmlns:w16cex="http://schemas.microsoft.com/office/word/2018/wordml/cex" xmlns:w16cid="http://schemas.microsoft.com/office/word/2016/wordml/cid" xmlns:w16="http://schemas.microsoft.com/office/word/2018/wordml" xmlns:w16du="http://schemas.microsoft.com/office/word/2023/wordml/word16du" xmlns:w16sdtdh="http://schemas.microsoft.com/office/word/2020/wordml/sdtdatahash" xmlns:w16sdtfl="http://schemas.microsoft.com/office/word/2024/wordml/sdtformatlock" xmlns:w16se="http://schemas.microsoft.com/office/word/2015/wordml/symex" xmlns:wpg="http://schemas.microsoft.com/office/word/2010/wordprocessingGroup" xmlns:wpi="http://schemas.microsoft.com/office/word/2010/wordprocessingInk" xmlns:wne="http://schemas.microsoft.com/office/word/2006/wordml" xmlns:wps="http://schemas.microsoft.com/office/word/2010/wordprocessingShape" mc:Ignorable="w14 w15 w16se w16cid w16 w16cex w16sdtdh w16sdtfl w16du wp14">
   <w:footnote w:type="separator" w:id="-1">
     <w:p>
       <w:pPr>
@@ -2626,11 +2626,11 @@
 </file>
 
 <file path=word/numbering.xml><?xml version="1.0" encoding="utf-8"?>
-<w:numbering xmlns:wpc="http://schemas.microsoft.com/office/word/2010/wordprocessingCanvas" xmlns:cx="http://schemas.microsoft.com/office/drawing/2014/chartex" xmlns:cx1="http://schemas.microsoft.com/office/drawing/2015/9/8/chartex" xmlns:cx2="http://schemas.microsoft.com/office/drawing/2015/10/21/chartex" xmlns:cx3="http://schemas.microsoft.com/office/drawing/2016/5/9/chartex" xmlns:cx4="http://schemas.microsoft.com/office/drawing/2016/5/10/chartex" xmlns:cx5="http://schemas.microsoft.com/office/drawing/2016/5/11/chartex" xmlns:cx6="http://schemas.microsoft.com/office/drawing/2016/5/12/chartex" xmlns:cx7="http://schemas.microsoft.com/office/drawing/2016/5/13/chartex" xmlns:cx8="http://schemas.microsoft.com/office/drawing/2016/5/14/chartex" xmlns:mc="http://schemas.openxmlformats.org/markup-compatibility/2006" xmlns:aink="http://schemas.microsoft.com/office/drawing/2016/ink" xmlns:am3d="http://schemas.microsoft.com/office/drawing/2017/model3d" xmlns:o="urn:schemas-microsoft-com:office:office" xmlns:oel="http://schemas.microsoft.com/office/2019/extlst" xmlns:r="http://schemas.openxmlformats.org/officeDocument/2006/relationships" xmlns:m="http://schemas.openxmlformats.org/officeDocument/2006/math" xmlns:v="urn:schemas-microsoft-com:vml" xmlns:wp14="http://schemas.microsoft.com/office/word/2010/wordprocessingDrawing" xmlns:wp="http://schemas.openxmlformats.org/drawingml/2006/wordprocessingDrawing" xmlns:w10="urn:schemas-microsoft-com:office:word" xmlns:w="http://schemas.openxmlformats.org/wordprocessingml/2006/main" xmlns:w14="http://schemas.microsoft.com/office/word/2010/wordml" xmlns:w15="http://schemas.microsoft.com/office/word/2012/wordml" xmlns:w16cex="http://schemas.microsoft.com/office/word/2018/wordml/cex" xmlns:w16cid="http://schemas.microsoft.com/office/word/2016/wordml/cid" xmlns:w16="http://schemas.microsoft.com/office/word/2018/wordml" xmlns:w16du="http://schemas.microsoft.com/office/word/2023/wordml/word16du" xmlns:w16sdtdh="http://schemas.microsoft.com/office/word/2020/wordml/sdtdatahash" xmlns:w16se="http://schemas.microsoft.com/office/word/2015/wordml/symex" xmlns:wpg="http://schemas.microsoft.com/office/word/2010/wordprocessingGroup" xmlns:wpi="http://schemas.microsoft.com/office/word/2010/wordprocessingInk" xmlns:wne="http://schemas.microsoft.com/office/word/2006/wordml" xmlns:wps="http://schemas.microsoft.com/office/word/2010/wordprocessingShape" mc:Ignorable="w14 w15 w16se w16cid w16 w16cex w16sdtdh w16du wp14">
+<w:numbering xmlns:wpc="http://schemas.microsoft.com/office/word/2010/wordprocessingCanvas" xmlns:cx="http://schemas.microsoft.com/office/drawing/2014/chartex" xmlns:cx1="http://schemas.microsoft.com/office/drawing/2015/9/8/chartex" xmlns:cx2="http://schemas.microsoft.com/office/drawing/2015/10/21/chartex" xmlns:cx3="http://schemas.microsoft.com/office/drawing/2016/5/9/chartex" xmlns:cx4="http://schemas.microsoft.com/office/drawing/2016/5/10/chartex" xmlns:cx5="http://schemas.microsoft.com/office/drawing/2016/5/11/chartex" xmlns:cx6="http://schemas.microsoft.com/office/drawing/2016/5/12/chartex" xmlns:cx7="http://schemas.microsoft.com/office/drawing/2016/5/13/chartex" xmlns:cx8="http://schemas.microsoft.com/office/drawing/2016/5/14/chartex" xmlns:mc="http://schemas.openxmlformats.org/markup-compatibility/2006" xmlns:aink="http://schemas.microsoft.com/office/drawing/2016/ink" xmlns:am3d="http://schemas.microsoft.com/office/drawing/2017/model3d" xmlns:o="urn:schemas-microsoft-com:office:office" xmlns:oel="http://schemas.microsoft.com/office/2019/extlst" xmlns:r="http://schemas.openxmlformats.org/officeDocument/2006/relationships" xmlns:m="http://schemas.openxmlformats.org/officeDocument/2006/math" xmlns:v="urn:schemas-microsoft-com:vml" xmlns:wp14="http://schemas.microsoft.com/office/word/2010/wordprocessingDrawing" xmlns:wp="http://schemas.openxmlformats.org/drawingml/2006/wordprocessingDrawing" xmlns:w10="urn:schemas-microsoft-com:office:word" xmlns:w="http://schemas.openxmlformats.org/wordprocessingml/2006/main" xmlns:w14="http://schemas.microsoft.com/office/word/2010/wordml" xmlns:w15="http://schemas.microsoft.com/office/word/2012/wordml" xmlns:w16cex="http://schemas.microsoft.com/office/word/2018/wordml/cex" xmlns:w16cid="http://schemas.microsoft.com/office/word/2016/wordml/cid" xmlns:w16="http://schemas.microsoft.com/office/word/2018/wordml" xmlns:w16du="http://schemas.microsoft.com/office/word/2023/wordml/word16du" xmlns:w16sdtdh="http://schemas.microsoft.com/office/word/2020/wordml/sdtdatahash" xmlns:w16sdtfl="http://schemas.microsoft.com/office/word/2024/wordml/sdtformatlock" xmlns:w16se="http://schemas.microsoft.com/office/word/2015/wordml/symex" xmlns:wpg="http://schemas.microsoft.com/office/word/2010/wordprocessingGroup" xmlns:wpi="http://schemas.microsoft.com/office/word/2010/wordprocessingInk" xmlns:wne="http://schemas.microsoft.com/office/word/2006/wordml" xmlns:wps="http://schemas.microsoft.com/office/word/2010/wordprocessingShape" mc:Ignorable="w14 w15 w16se w16cid w16 w16cex w16sdtdh w16sdtfl w16du wp14">
   <w:abstractNum w:abstractNumId="0" w15:restartNumberingAfterBreak="0">
     <w:nsid w:val="4214429C"/>
     <w:multiLevelType w:val="multilevel"/>
-    <w:tmpl w:val="83725470"/>
+    <w:tmpl w:val="ECE0EFCE"/>
     <w:lvl w:ilvl="0">
       <w:start w:val="1"/>
       <w:numFmt w:val="decimal"/>
@@ -3877,7 +3877,7 @@
 </file>
 
 <file path=word/styles.xml><?xml version="1.0" encoding="utf-8"?>
-<w:styles xmlns:mc="http://schemas.openxmlformats.org/markup-compatibility/2006" xmlns:r="http://schemas.openxmlformats.org/officeDocument/2006/relationships" xmlns:w="http://schemas.openxmlformats.org/wordprocessingml/2006/main" xmlns:w14="http://schemas.microsoft.com/office/word/2010/wordml" xmlns:w15="http://schemas.microsoft.com/office/word/2012/wordml" xmlns:w16cex="http://schemas.microsoft.com/office/word/2018/wordml/cex" xmlns:w16cid="http://schemas.microsoft.com/office/word/2016/wordml/cid" xmlns:w16="http://schemas.microsoft.com/office/word/2018/wordml" xmlns:w16du="http://schemas.microsoft.com/office/word/2023/wordml/word16du" xmlns:w16sdtdh="http://schemas.microsoft.com/office/word/2020/wordml/sdtdatahash" xmlns:w16se="http://schemas.microsoft.com/office/word/2015/wordml/symex" mc:Ignorable="w14 w15 w16se w16cid w16 w16cex w16sdtdh w16du">
+<w:styles xmlns:mc="http://schemas.openxmlformats.org/markup-compatibility/2006" xmlns:r="http://schemas.openxmlformats.org/officeDocument/2006/relationships" xmlns:w="http://schemas.openxmlformats.org/wordprocessingml/2006/main" xmlns:w14="http://schemas.microsoft.com/office/word/2010/wordml" xmlns:w15="http://schemas.microsoft.com/office/word/2012/wordml" xmlns:w16cex="http://schemas.microsoft.com/office/word/2018/wordml/cex" xmlns:w16cid="http://schemas.microsoft.com/office/word/2016/wordml/cid" xmlns:w16="http://schemas.microsoft.com/office/word/2018/wordml" xmlns:w16du="http://schemas.microsoft.com/office/word/2023/wordml/word16du" xmlns:w16sdtdh="http://schemas.microsoft.com/office/word/2020/wordml/sdtdatahash" xmlns:w16sdtfl="http://schemas.microsoft.com/office/word/2024/wordml/sdtformatlock" xmlns:w16se="http://schemas.microsoft.com/office/word/2015/wordml/symex" mc:Ignorable="w14 w15 w16se w16cid w16 w16cex w16sdtdh w16sdtfl w16du">
   <w:docDefaults>
     <w:rPrDefault>
       <w:rPr>
@@ -4386,7 +4386,7 @@
     <w:uiPriority w:val="9"/>
     <w:unhideWhenUsed/>
     <w:qFormat/>
-    <w:rsid w:val="008079D1"/>
+    <w:rsid w:val="00AC32E8"/>
     <w:pPr>
       <w:numPr>
         <w:ilvl w:val="3"/>
@@ -4575,7 +4575,7 @@
     <w:basedOn w:val="a1"/>
     <w:link w:val="5"/>
     <w:uiPriority w:val="9"/>
-    <w:rsid w:val="008079D1"/>
+    <w:rsid w:val="00AC32E8"/>
     <w:rPr>
       <w:sz w:val="18"/>
     </w:rPr>

</xml_diff>